<commit_message>
feat: agregar campos destino a develop
</commit_message>
<xml_diff>
--- a/pesaje/develop/Report/PrintTicket.docx
+++ b/pesaje/develop/Report/PrintTicket.docx
@@ -26,6 +26,9 @@
               <w:pStyle w:val="Encabezado"/>
               <w:ind w:left="142"/>
               <w:jc w:val="center"/>
+              <w:rPr>
+                <w:color w:val="000000" w:themeColor="text1"/>
+              </w:rPr>
             </w:pPr>
           </w:p>
         </w:tc>
@@ -40,6 +43,7 @@
                 <w:rFonts w:ascii="Arial" w:hAnsi="Arial"/>
                 <w:b/>
                 <w:bCs/>
+                <w:color w:val="000000" w:themeColor="text1"/>
                 <w:sz w:val="28"/>
                 <w:szCs w:val="28"/>
                 <w:lang w:val="it-IT"/>
@@ -49,6 +53,7 @@
               <w:rPr>
                 <w:rFonts w:ascii="Times New Roman" w:hAnsi="Times New Roman" w:cs="Times New Roman"/>
                 <w:noProof/>
+                <w:color w:val="000000" w:themeColor="text1"/>
                 <w:sz w:val="24"/>
                 <w:szCs w:val="24"/>
                 <w:lang w:val="es-PE" w:eastAsia="es-PE"/>
@@ -225,6 +230,7 @@
                 <w:rFonts w:ascii="Arial" w:hAnsi="Arial"/>
                 <w:b/>
                 <w:bCs/>
+                <w:color w:val="000000" w:themeColor="text1"/>
                 <w:sz w:val="28"/>
                 <w:szCs w:val="28"/>
                 <w:lang w:val="it-IT"/>
@@ -236,6 +242,7 @@
                 <w:rFonts w:ascii="Arial" w:hAnsi="Arial"/>
                 <w:b/>
                 <w:bCs/>
+                <w:color w:val="000000" w:themeColor="text1"/>
                 <w:sz w:val="28"/>
                 <w:szCs w:val="28"/>
                 <w:lang w:val="it-IT"/>
@@ -247,6 +254,7 @@
                 <w:rFonts w:ascii="Arial" w:hAnsi="Arial"/>
                 <w:b/>
                 <w:bCs/>
+                <w:color w:val="000000" w:themeColor="text1"/>
                 <w:sz w:val="28"/>
                 <w:szCs w:val="28"/>
                 <w:lang w:val="it-IT"/>
@@ -259,6 +267,7 @@
                 <w:b/>
                 <w:bCs/>
                 <w:noProof/>
+                <w:color w:val="000000" w:themeColor="text1"/>
                 <w:sz w:val="28"/>
                 <w:szCs w:val="28"/>
                 <w:lang w:val="it-IT"/>
@@ -270,6 +279,7 @@
                 <w:rFonts w:ascii="Arial" w:hAnsi="Arial"/>
                 <w:b/>
                 <w:bCs/>
+                <w:color w:val="000000" w:themeColor="text1"/>
                 <w:sz w:val="28"/>
                 <w:szCs w:val="28"/>
                 <w:lang w:val="it-IT"/>
@@ -286,6 +296,7 @@
                 <w:rFonts w:ascii="Arial" w:hAnsi="Arial"/>
                 <w:b/>
                 <w:bCs/>
+                <w:color w:val="000000" w:themeColor="text1"/>
                 <w:sz w:val="24"/>
                 <w:szCs w:val="24"/>
                 <w:lang w:val="it-IT"/>
@@ -296,6 +307,7 @@
                 <w:rFonts w:ascii="Arial" w:hAnsi="Arial"/>
                 <w:b/>
                 <w:bCs/>
+                <w:color w:val="000000" w:themeColor="text1"/>
                 <w:lang w:val="it-IT"/>
               </w:rPr>
               <w:fldChar w:fldCharType="begin"/>
@@ -305,6 +317,7 @@
                 <w:rFonts w:ascii="Arial" w:hAnsi="Arial"/>
                 <w:b/>
                 <w:bCs/>
+                <w:color w:val="000000" w:themeColor="text1"/>
                 <w:lang w:val="it-IT"/>
               </w:rPr>
               <w:instrText xml:space="preserve"> MERGEFIELD  </w:instrText>
@@ -315,6 +328,7 @@
                 <w:b/>
                 <w:bCs/>
                 <w:noProof/>
+                <w:color w:val="000000" w:themeColor="text1"/>
                 <w:lang w:val="it-IT"/>
               </w:rPr>
               <w:instrText>direc_empresa</w:instrText>
@@ -324,6 +338,7 @@
                 <w:rFonts w:ascii="Arial" w:hAnsi="Arial"/>
                 <w:b/>
                 <w:bCs/>
+                <w:color w:val="000000" w:themeColor="text1"/>
                 <w:lang w:val="it-IT"/>
               </w:rPr>
               <w:instrText xml:space="preserve">  \* MERGEFORMAT </w:instrText>
@@ -333,6 +348,7 @@
                 <w:rFonts w:ascii="Arial" w:hAnsi="Arial"/>
                 <w:b/>
                 <w:bCs/>
+                <w:color w:val="000000" w:themeColor="text1"/>
                 <w:lang w:val="it-IT"/>
               </w:rPr>
               <w:fldChar w:fldCharType="separate"/>
@@ -343,6 +359,7 @@
                 <w:b/>
                 <w:bCs/>
                 <w:noProof/>
+                <w:color w:val="000000" w:themeColor="text1"/>
                 <w:lang w:val="it-IT"/>
               </w:rPr>
               <w:t>«direc_empresa»</w:t>
@@ -352,6 +369,7 @@
                 <w:rFonts w:ascii="Arial" w:hAnsi="Arial"/>
                 <w:b/>
                 <w:bCs/>
+                <w:color w:val="000000" w:themeColor="text1"/>
                 <w:lang w:val="it-IT"/>
               </w:rPr>
               <w:fldChar w:fldCharType="end"/>
@@ -364,6 +382,7 @@
                 <w:rFonts w:ascii="Arial" w:hAnsi="Arial"/>
                 <w:b/>
                 <w:bCs/>
+                <w:color w:val="000000" w:themeColor="text1"/>
                 <w:sz w:val="28"/>
                 <w:szCs w:val="28"/>
                 <w:lang w:val="it-IT"/>
@@ -384,6 +403,7 @@
                 <w:b/>
                 <w:bCs/>
                 <w:noProof/>
+                <w:color w:val="000000" w:themeColor="text1"/>
                 <w:lang w:val="es-PE" w:eastAsia="es-PE"/>
               </w:rPr>
             </w:pPr>
@@ -392,6 +412,7 @@
                 <w:rFonts w:ascii="Arial" w:hAnsi="Arial"/>
                 <w:b/>
                 <w:noProof/>
+                <w:color w:val="000000" w:themeColor="text1"/>
                 <w:sz w:val="36"/>
                 <w:szCs w:val="36"/>
               </w:rPr>
@@ -402,6 +423,7 @@
                 <w:rFonts w:ascii="Arial" w:hAnsi="Arial"/>
                 <w:b/>
                 <w:noProof/>
+                <w:color w:val="000000" w:themeColor="text1"/>
                 <w:sz w:val="36"/>
                 <w:szCs w:val="36"/>
               </w:rPr>
@@ -412,6 +434,7 @@
                 <w:rFonts w:ascii="Arial" w:hAnsi="Arial"/>
                 <w:b/>
                 <w:noProof/>
+                <w:color w:val="000000" w:themeColor="text1"/>
                 <w:sz w:val="36"/>
                 <w:szCs w:val="36"/>
               </w:rPr>
@@ -422,6 +445,7 @@
                 <w:rFonts w:ascii="Arial" w:hAnsi="Arial"/>
                 <w:b/>
                 <w:noProof/>
+                <w:color w:val="000000" w:themeColor="text1"/>
                 <w:sz w:val="36"/>
                 <w:szCs w:val="36"/>
               </w:rPr>
@@ -432,6 +456,7 @@
                 <w:rFonts w:ascii="Arial" w:hAnsi="Arial"/>
                 <w:b/>
                 <w:noProof/>
+                <w:color w:val="000000" w:themeColor="text1"/>
                 <w:sz w:val="36"/>
                 <w:szCs w:val="36"/>
               </w:rPr>
@@ -566,26 +591,28 @@
       </w:tblGrid>
       <w:tr>
         <w:trPr>
-          <w:trHeight w:val="375"/>
+          <w:trHeight w:val="188"/>
         </w:trPr>
         <w:tc>
           <w:tcPr>
-            <w:tcW w:w="1854" w:type="dxa"/>
-          </w:tcPr>
-          <w:p>
-            <w:pPr>
-              <w:rPr>
-                <w:rFonts w:ascii="Arial" w:hAnsi="Arial"/>
-                <w:bCs/>
-                <w:color w:val="000000" w:themeColor="text1"/>
-                <w:sz w:val="16"/>
-                <w:szCs w:val="16"/>
-              </w:rPr>
-            </w:pPr>
-            <w:r>
-              <w:rPr>
-                <w:rFonts w:ascii="Arial" w:hAnsi="Arial"/>
-                <w:b/>
+            <w:tcW w:w="1849" w:type="dxa"/>
+          </w:tcPr>
+          <w:p>
+            <w:pPr>
+              <w:rPr>
+                <w:rFonts w:ascii="Arial" w:hAnsi="Arial"/>
+                <w:b/>
+                <w:bCs/>
+                <w:color w:val="000000" w:themeColor="text1"/>
+                <w:sz w:val="16"/>
+                <w:szCs w:val="16"/>
+              </w:rPr>
+            </w:pPr>
+            <w:r>
+              <w:rPr>
+                <w:rFonts w:ascii="Arial" w:hAnsi="Arial"/>
+                <w:b/>
+                <w:bCs/>
                 <w:color w:val="000000" w:themeColor="text1"/>
                 <w:sz w:val="16"/>
                 <w:szCs w:val="16"/>
@@ -597,22 +624,20 @@
         </w:tc>
         <w:tc>
           <w:tcPr>
-            <w:tcW w:w="3955" w:type="dxa"/>
-          </w:tcPr>
-          <w:p>
-            <w:pPr>
-              <w:rPr>
-                <w:rFonts w:ascii="Arial" w:hAnsi="Arial"/>
-                <w:bCs/>
-                <w:color w:val="000000" w:themeColor="text1"/>
-                <w:sz w:val="16"/>
-                <w:szCs w:val="16"/>
-              </w:rPr>
-            </w:pPr>
-            <w:r>
-              <w:rPr>
-                <w:rFonts w:ascii="Arial" w:hAnsi="Arial"/>
-                <w:bCs/>
+            <w:tcW w:w="3945" w:type="dxa"/>
+          </w:tcPr>
+          <w:p>
+            <w:pPr>
+              <w:rPr>
+                <w:rFonts w:ascii="Arial" w:hAnsi="Arial"/>
+                <w:color w:val="000000" w:themeColor="text1"/>
+                <w:sz w:val="16"/>
+                <w:szCs w:val="16"/>
+              </w:rPr>
+            </w:pPr>
+            <w:r>
+              <w:rPr>
+                <w:rFonts w:ascii="Arial" w:hAnsi="Arial"/>
                 <w:color w:val="000000" w:themeColor="text1"/>
                 <w:sz w:val="16"/>
                 <w:szCs w:val="16"/>
@@ -622,7 +647,6 @@
             <w:r>
               <w:rPr>
                 <w:rFonts w:ascii="Arial" w:hAnsi="Arial"/>
-                <w:bCs/>
                 <w:color w:val="000000" w:themeColor="text1"/>
                 <w:sz w:val="16"/>
                 <w:szCs w:val="16"/>
@@ -632,8 +656,6 @@
             <w:r>
               <w:rPr>
                 <w:rFonts w:ascii="Arial" w:hAnsi="Arial"/>
-                <w:bCs/>
-                <w:noProof/>
                 <w:color w:val="000000" w:themeColor="text1"/>
                 <w:sz w:val="16"/>
                 <w:szCs w:val="16"/>
@@ -643,7 +665,6 @@
             <w:r>
               <w:rPr>
                 <w:rFonts w:ascii="Arial" w:hAnsi="Arial"/>
-                <w:bCs/>
                 <w:color w:val="000000" w:themeColor="text1"/>
                 <w:sz w:val="16"/>
                 <w:szCs w:val="16"/>
@@ -653,7 +674,6 @@
             <w:r>
               <w:rPr>
                 <w:rFonts w:ascii="Arial" w:hAnsi="Arial"/>
-                <w:bCs/>
                 <w:color w:val="000000" w:themeColor="text1"/>
                 <w:sz w:val="16"/>
                 <w:szCs w:val="16"/>
@@ -663,8 +683,6 @@
             <w:r>
               <w:rPr>
                 <w:rFonts w:ascii="Arial" w:hAnsi="Arial"/>
-                <w:bCs/>
-                <w:noProof/>
                 <w:color w:val="000000" w:themeColor="text1"/>
                 <w:sz w:val="16"/>
                 <w:szCs w:val="16"/>
@@ -674,7 +692,6 @@
             <w:r>
               <w:rPr>
                 <w:rFonts w:ascii="Arial" w:hAnsi="Arial"/>
-                <w:bCs/>
                 <w:color w:val="000000" w:themeColor="text1"/>
                 <w:sz w:val="16"/>
                 <w:szCs w:val="16"/>
@@ -685,50 +702,77 @@
         </w:tc>
         <w:tc>
           <w:tcPr>
-            <w:tcW w:w="2903" w:type="dxa"/>
-          </w:tcPr>
-          <w:p>
-            <w:pPr>
-              <w:rPr>
-                <w:rFonts w:ascii="Arial" w:hAnsi="Arial"/>
-                <w:bCs/>
-                <w:color w:val="000000" w:themeColor="text1"/>
-                <w:sz w:val="16"/>
-                <w:szCs w:val="16"/>
-              </w:rPr>
-            </w:pPr>
-            <w:r>
-              <w:rPr>
-                <w:rFonts w:ascii="Arial" w:hAnsi="Arial"/>
-                <w:b/>
+            <w:tcW w:w="2896" w:type="dxa"/>
+          </w:tcPr>
+          <w:p>
+            <w:pPr>
+              <w:rPr>
+                <w:rFonts w:ascii="Arial" w:hAnsi="Arial"/>
+                <w:b/>
+                <w:bCs/>
+                <w:color w:val="000000" w:themeColor="text1"/>
+                <w:sz w:val="16"/>
+                <w:szCs w:val="16"/>
+              </w:rPr>
+            </w:pPr>
+            <w:proofErr w:type="gramStart"/>
+            <w:r>
+              <w:rPr>
+                <w:rFonts w:ascii="Arial" w:hAnsi="Arial"/>
+                <w:b/>
+                <w:bCs/>
                 <w:color w:val="000000" w:themeColor="text1"/>
                 <w:sz w:val="16"/>
                 <w:szCs w:val="16"/>
                 <w:lang w:val="es-PE"/>
               </w:rPr>
-              <w:t>Ticket de Pesaje N°</w:t>
-            </w:r>
-          </w:p>
-        </w:tc>
-        <w:tc>
-          <w:tcPr>
-            <w:tcW w:w="2904" w:type="dxa"/>
-          </w:tcPr>
-          <w:p>
-            <w:pPr>
-              <w:rPr>
-                <w:rFonts w:ascii="Arial" w:hAnsi="Arial"/>
-                <w:bCs/>
-                <w:color w:val="000000" w:themeColor="text1"/>
-                <w:sz w:val="16"/>
-                <w:szCs w:val="16"/>
-              </w:rPr>
-            </w:pPr>
-            <w:r>
-              <w:rPr>
-                <w:rFonts w:ascii="Arial" w:hAnsi="Arial"/>
-                <w:bCs/>
-                <w:noProof/>
+              <w:t>Ticket</w:t>
+            </w:r>
+            <w:proofErr w:type="gramEnd"/>
+            <w:r>
+              <w:rPr>
+                <w:rFonts w:ascii="Arial" w:hAnsi="Arial"/>
+                <w:b/>
+                <w:bCs/>
+                <w:color w:val="000000" w:themeColor="text1"/>
+                <w:sz w:val="16"/>
+                <w:szCs w:val="16"/>
+                <w:lang w:val="es-PE"/>
+              </w:rPr>
+              <w:t xml:space="preserve"> de Pesaje </w:t>
+            </w:r>
+            <w:proofErr w:type="spellStart"/>
+            <w:r>
+              <w:rPr>
+                <w:rFonts w:ascii="Arial" w:hAnsi="Arial"/>
+                <w:b/>
+                <w:bCs/>
+                <w:color w:val="000000" w:themeColor="text1"/>
+                <w:sz w:val="16"/>
+                <w:szCs w:val="16"/>
+                <w:lang w:val="es-PE"/>
+              </w:rPr>
+              <w:t>N°</w:t>
+            </w:r>
+            <w:proofErr w:type="spellEnd"/>
+          </w:p>
+        </w:tc>
+        <w:tc>
+          <w:tcPr>
+            <w:tcW w:w="2898" w:type="dxa"/>
+          </w:tcPr>
+          <w:p>
+            <w:pPr>
+              <w:rPr>
+                <w:rFonts w:ascii="Arial" w:hAnsi="Arial"/>
+                <w:color w:val="000000" w:themeColor="text1"/>
+                <w:sz w:val="16"/>
+                <w:szCs w:val="16"/>
+              </w:rPr>
+            </w:pPr>
+            <w:r>
+              <w:rPr>
+                <w:rFonts w:ascii="Arial" w:hAnsi="Arial"/>
                 <w:color w:val="000000" w:themeColor="text1"/>
                 <w:sz w:val="16"/>
                 <w:szCs w:val="16"/>
@@ -738,8 +782,6 @@
             <w:r>
               <w:rPr>
                 <w:rFonts w:ascii="Arial" w:hAnsi="Arial"/>
-                <w:bCs/>
-                <w:noProof/>
                 <w:color w:val="000000" w:themeColor="text1"/>
                 <w:sz w:val="16"/>
                 <w:szCs w:val="16"/>
@@ -749,8 +791,6 @@
             <w:r>
               <w:rPr>
                 <w:rFonts w:ascii="Arial" w:hAnsi="Arial"/>
-                <w:bCs/>
-                <w:noProof/>
                 <w:color w:val="000000" w:themeColor="text1"/>
                 <w:sz w:val="16"/>
                 <w:szCs w:val="16"/>
@@ -760,8 +800,6 @@
             <w:r>
               <w:rPr>
                 <w:rFonts w:ascii="Arial" w:hAnsi="Arial"/>
-                <w:bCs/>
-                <w:noProof/>
                 <w:color w:val="000000" w:themeColor="text1"/>
                 <w:sz w:val="16"/>
                 <w:szCs w:val="16"/>
@@ -771,8 +809,6 @@
             <w:r>
               <w:rPr>
                 <w:rFonts w:ascii="Arial" w:hAnsi="Arial"/>
-                <w:bCs/>
-                <w:noProof/>
                 <w:color w:val="000000" w:themeColor="text1"/>
                 <w:sz w:val="16"/>
                 <w:szCs w:val="16"/>
@@ -784,26 +820,28 @@
       </w:tr>
       <w:tr>
         <w:trPr>
-          <w:trHeight w:val="375"/>
+          <w:trHeight w:val="233"/>
         </w:trPr>
         <w:tc>
           <w:tcPr>
-            <w:tcW w:w="1854" w:type="dxa"/>
-          </w:tcPr>
-          <w:p>
-            <w:pPr>
-              <w:rPr>
-                <w:rFonts w:ascii="Arial" w:hAnsi="Arial"/>
-                <w:bCs/>
-                <w:color w:val="000000" w:themeColor="text1"/>
-                <w:sz w:val="16"/>
-                <w:szCs w:val="16"/>
-              </w:rPr>
-            </w:pPr>
-            <w:r>
-              <w:rPr>
-                <w:rFonts w:ascii="Arial" w:hAnsi="Arial"/>
-                <w:b/>
+            <w:tcW w:w="1849" w:type="dxa"/>
+          </w:tcPr>
+          <w:p>
+            <w:pPr>
+              <w:rPr>
+                <w:rFonts w:ascii="Arial" w:hAnsi="Arial"/>
+                <w:b/>
+                <w:bCs/>
+                <w:color w:val="000000" w:themeColor="text1"/>
+                <w:sz w:val="16"/>
+                <w:szCs w:val="16"/>
+              </w:rPr>
+            </w:pPr>
+            <w:r>
+              <w:rPr>
+                <w:rFonts w:ascii="Arial" w:hAnsi="Arial"/>
+                <w:b/>
+                <w:bCs/>
                 <w:color w:val="000000" w:themeColor="text1"/>
                 <w:sz w:val="16"/>
                 <w:szCs w:val="16"/>
@@ -815,23 +853,20 @@
         </w:tc>
         <w:tc>
           <w:tcPr>
-            <w:tcW w:w="3955" w:type="dxa"/>
-          </w:tcPr>
-          <w:p>
-            <w:pPr>
-              <w:rPr>
-                <w:rFonts w:ascii="Arial" w:hAnsi="Arial"/>
-                <w:bCs/>
-                <w:color w:val="000000" w:themeColor="text1"/>
-                <w:sz w:val="16"/>
-                <w:szCs w:val="16"/>
-              </w:rPr>
-            </w:pPr>
-            <w:r>
-              <w:rPr>
-                <w:rFonts w:ascii="Arial" w:hAnsi="Arial"/>
-                <w:bCs/>
-                <w:noProof/>
+            <w:tcW w:w="3945" w:type="dxa"/>
+          </w:tcPr>
+          <w:p>
+            <w:pPr>
+              <w:rPr>
+                <w:rFonts w:ascii="Arial" w:hAnsi="Arial"/>
+                <w:color w:val="000000" w:themeColor="text1"/>
+                <w:sz w:val="16"/>
+                <w:szCs w:val="16"/>
+              </w:rPr>
+            </w:pPr>
+            <w:r>
+              <w:rPr>
+                <w:rFonts w:ascii="Arial" w:hAnsi="Arial"/>
                 <w:color w:val="000000" w:themeColor="text1"/>
                 <w:sz w:val="16"/>
                 <w:szCs w:val="16"/>
@@ -841,8 +876,6 @@
             <w:r>
               <w:rPr>
                 <w:rFonts w:ascii="Arial" w:hAnsi="Arial"/>
-                <w:bCs/>
-                <w:noProof/>
                 <w:color w:val="000000" w:themeColor="text1"/>
                 <w:sz w:val="16"/>
                 <w:szCs w:val="16"/>
@@ -852,8 +885,6 @@
             <w:r>
               <w:rPr>
                 <w:rFonts w:ascii="Arial" w:hAnsi="Arial"/>
-                <w:bCs/>
-                <w:noProof/>
                 <w:color w:val="000000" w:themeColor="text1"/>
                 <w:sz w:val="16"/>
                 <w:szCs w:val="16"/>
@@ -863,8 +894,6 @@
             <w:r>
               <w:rPr>
                 <w:rFonts w:ascii="Arial" w:hAnsi="Arial"/>
-                <w:bCs/>
-                <w:noProof/>
                 <w:color w:val="000000" w:themeColor="text1"/>
                 <w:sz w:val="16"/>
                 <w:szCs w:val="16"/>
@@ -874,8 +903,6 @@
             <w:r>
               <w:rPr>
                 <w:rFonts w:ascii="Arial" w:hAnsi="Arial"/>
-                <w:bCs/>
-                <w:noProof/>
                 <w:color w:val="000000" w:themeColor="text1"/>
                 <w:sz w:val="16"/>
                 <w:szCs w:val="16"/>
@@ -886,22 +913,24 @@
         </w:tc>
         <w:tc>
           <w:tcPr>
-            <w:tcW w:w="2903" w:type="dxa"/>
-          </w:tcPr>
-          <w:p>
-            <w:pPr>
-              <w:rPr>
-                <w:rFonts w:ascii="Arial" w:hAnsi="Arial"/>
-                <w:bCs/>
-                <w:color w:val="000000" w:themeColor="text1"/>
-                <w:sz w:val="16"/>
-                <w:szCs w:val="16"/>
-              </w:rPr>
-            </w:pPr>
-            <w:r>
-              <w:rPr>
-                <w:rFonts w:ascii="Arial" w:hAnsi="Arial"/>
-                <w:b/>
+            <w:tcW w:w="2896" w:type="dxa"/>
+          </w:tcPr>
+          <w:p>
+            <w:pPr>
+              <w:rPr>
+                <w:rFonts w:ascii="Arial" w:hAnsi="Arial"/>
+                <w:b/>
+                <w:bCs/>
+                <w:color w:val="000000" w:themeColor="text1"/>
+                <w:sz w:val="16"/>
+                <w:szCs w:val="16"/>
+              </w:rPr>
+            </w:pPr>
+            <w:r>
+              <w:rPr>
+                <w:rFonts w:ascii="Arial" w:hAnsi="Arial"/>
+                <w:b/>
+                <w:bCs/>
                 <w:color w:val="000000" w:themeColor="text1"/>
                 <w:sz w:val="16"/>
                 <w:szCs w:val="16"/>
@@ -913,22 +942,20 @@
         </w:tc>
         <w:tc>
           <w:tcPr>
-            <w:tcW w:w="2904" w:type="dxa"/>
-          </w:tcPr>
-          <w:p>
-            <w:pPr>
-              <w:rPr>
-                <w:rFonts w:ascii="Arial" w:hAnsi="Arial"/>
-                <w:bCs/>
-                <w:color w:val="000000" w:themeColor="text1"/>
-                <w:sz w:val="16"/>
-                <w:szCs w:val="16"/>
-              </w:rPr>
-            </w:pPr>
-            <w:r>
-              <w:rPr>
-                <w:rFonts w:ascii="Arial" w:hAnsi="Arial"/>
-                <w:bCs/>
+            <w:tcW w:w="2898" w:type="dxa"/>
+          </w:tcPr>
+          <w:p>
+            <w:pPr>
+              <w:rPr>
+                <w:rFonts w:ascii="Arial" w:hAnsi="Arial"/>
+                <w:color w:val="000000" w:themeColor="text1"/>
+                <w:sz w:val="16"/>
+                <w:szCs w:val="16"/>
+              </w:rPr>
+            </w:pPr>
+            <w:r>
+              <w:rPr>
+                <w:rFonts w:ascii="Arial" w:hAnsi="Arial"/>
                 <w:color w:val="000000" w:themeColor="text1"/>
                 <w:sz w:val="16"/>
                 <w:szCs w:val="16"/>
@@ -938,7 +965,6 @@
             <w:r>
               <w:rPr>
                 <w:rFonts w:ascii="Arial" w:hAnsi="Arial"/>
-                <w:bCs/>
                 <w:color w:val="000000" w:themeColor="text1"/>
                 <w:sz w:val="16"/>
                 <w:szCs w:val="16"/>
@@ -948,7 +974,6 @@
             <w:r>
               <w:rPr>
                 <w:rFonts w:ascii="Arial" w:hAnsi="Arial"/>
-                <w:bCs/>
                 <w:color w:val="000000" w:themeColor="text1"/>
                 <w:sz w:val="16"/>
                 <w:szCs w:val="16"/>
@@ -958,7 +983,6 @@
             <w:r>
               <w:rPr>
                 <w:rFonts w:ascii="Arial" w:hAnsi="Arial"/>
-                <w:bCs/>
                 <w:color w:val="000000" w:themeColor="text1"/>
                 <w:sz w:val="16"/>
                 <w:szCs w:val="16"/>
@@ -968,7 +992,6 @@
             <w:r>
               <w:rPr>
                 <w:rFonts w:ascii="Arial" w:hAnsi="Arial"/>
-                <w:bCs/>
                 <w:color w:val="000000" w:themeColor="text1"/>
                 <w:sz w:val="16"/>
                 <w:szCs w:val="16"/>
@@ -978,8 +1001,6 @@
             <w:r>
               <w:rPr>
                 <w:rFonts w:ascii="Arial" w:hAnsi="Arial"/>
-                <w:bCs/>
-                <w:noProof/>
                 <w:color w:val="000000" w:themeColor="text1"/>
                 <w:sz w:val="16"/>
                 <w:szCs w:val="16"/>
@@ -989,7 +1010,6 @@
             <w:r>
               <w:rPr>
                 <w:rFonts w:ascii="Arial" w:hAnsi="Arial"/>
-                <w:bCs/>
                 <w:color w:val="000000" w:themeColor="text1"/>
                 <w:sz w:val="16"/>
                 <w:szCs w:val="16"/>
@@ -1001,17 +1021,18 @@
       </w:tr>
       <w:tr>
         <w:trPr>
-          <w:trHeight w:val="375"/>
+          <w:trHeight w:val="266"/>
         </w:trPr>
         <w:tc>
           <w:tcPr>
-            <w:tcW w:w="1854" w:type="dxa"/>
-          </w:tcPr>
-          <w:p>
-            <w:pPr>
-              <w:rPr>
-                <w:rFonts w:ascii="Arial" w:hAnsi="Arial"/>
-                <w:b/>
+            <w:tcW w:w="1849" w:type="dxa"/>
+          </w:tcPr>
+          <w:p>
+            <w:pPr>
+              <w:rPr>
+                <w:rFonts w:ascii="Arial" w:hAnsi="Arial"/>
+                <w:b/>
+                <w:bCs/>
                 <w:color w:val="000000" w:themeColor="text1"/>
                 <w:sz w:val="16"/>
                 <w:szCs w:val="16"/>
@@ -1022,6 +1043,7 @@
               <w:rPr>
                 <w:rFonts w:ascii="Arial" w:hAnsi="Arial"/>
                 <w:b/>
+                <w:bCs/>
                 <w:color w:val="000000" w:themeColor="text1"/>
                 <w:sz w:val="16"/>
                 <w:szCs w:val="16"/>
@@ -1033,22 +1055,20 @@
         </w:tc>
         <w:tc>
           <w:tcPr>
-            <w:tcW w:w="3955" w:type="dxa"/>
-          </w:tcPr>
-          <w:p>
-            <w:pPr>
-              <w:rPr>
-                <w:rFonts w:ascii="Arial" w:hAnsi="Arial"/>
-                <w:bCs/>
-                <w:color w:val="000000" w:themeColor="text1"/>
-                <w:sz w:val="16"/>
-                <w:szCs w:val="16"/>
-              </w:rPr>
-            </w:pPr>
-            <w:r>
-              <w:rPr>
-                <w:rFonts w:ascii="Arial" w:hAnsi="Arial"/>
-                <w:bCs/>
+            <w:tcW w:w="3945" w:type="dxa"/>
+          </w:tcPr>
+          <w:p>
+            <w:pPr>
+              <w:rPr>
+                <w:rFonts w:ascii="Arial" w:hAnsi="Arial"/>
+                <w:color w:val="000000" w:themeColor="text1"/>
+                <w:sz w:val="16"/>
+                <w:szCs w:val="16"/>
+              </w:rPr>
+            </w:pPr>
+            <w:r>
+              <w:rPr>
+                <w:rFonts w:ascii="Arial" w:hAnsi="Arial"/>
                 <w:color w:val="000000" w:themeColor="text1"/>
                 <w:sz w:val="16"/>
                 <w:szCs w:val="16"/>
@@ -1058,7 +1078,6 @@
             <w:r>
               <w:rPr>
                 <w:rFonts w:ascii="Arial" w:hAnsi="Arial"/>
-                <w:bCs/>
                 <w:color w:val="000000" w:themeColor="text1"/>
                 <w:sz w:val="16"/>
                 <w:szCs w:val="16"/>
@@ -1068,7 +1087,6 @@
             <w:r>
               <w:rPr>
                 <w:rFonts w:ascii="Arial" w:hAnsi="Arial"/>
-                <w:bCs/>
                 <w:color w:val="000000" w:themeColor="text1"/>
                 <w:sz w:val="16"/>
                 <w:szCs w:val="16"/>
@@ -1078,8 +1096,6 @@
             <w:r>
               <w:rPr>
                 <w:rFonts w:ascii="Arial" w:hAnsi="Arial"/>
-                <w:bCs/>
-                <w:noProof/>
                 <w:color w:val="000000" w:themeColor="text1"/>
                 <w:sz w:val="16"/>
                 <w:szCs w:val="16"/>
@@ -1089,7 +1105,6 @@
             <w:r>
               <w:rPr>
                 <w:rFonts w:ascii="Arial" w:hAnsi="Arial"/>
-                <w:bCs/>
                 <w:color w:val="000000" w:themeColor="text1"/>
                 <w:sz w:val="16"/>
                 <w:szCs w:val="16"/>
@@ -1100,13 +1115,14 @@
         </w:tc>
         <w:tc>
           <w:tcPr>
-            <w:tcW w:w="2903" w:type="dxa"/>
-          </w:tcPr>
-          <w:p>
-            <w:pPr>
-              <w:rPr>
-                <w:rFonts w:ascii="Arial" w:hAnsi="Arial"/>
-                <w:b/>
+            <w:tcW w:w="2896" w:type="dxa"/>
+          </w:tcPr>
+          <w:p>
+            <w:pPr>
+              <w:rPr>
+                <w:rFonts w:ascii="Arial" w:hAnsi="Arial"/>
+                <w:b/>
+                <w:bCs/>
                 <w:color w:val="000000" w:themeColor="text1"/>
                 <w:sz w:val="16"/>
                 <w:szCs w:val="16"/>
@@ -1117,6 +1133,7 @@
               <w:rPr>
                 <w:rFonts w:ascii="Arial" w:hAnsi="Arial"/>
                 <w:b/>
+                <w:bCs/>
                 <w:color w:val="000000" w:themeColor="text1"/>
                 <w:sz w:val="16"/>
                 <w:szCs w:val="16"/>
@@ -1128,22 +1145,20 @@
         </w:tc>
         <w:tc>
           <w:tcPr>
-            <w:tcW w:w="2904" w:type="dxa"/>
-          </w:tcPr>
-          <w:p>
-            <w:pPr>
-              <w:rPr>
-                <w:rFonts w:ascii="Arial" w:hAnsi="Arial"/>
-                <w:bCs/>
-                <w:color w:val="000000" w:themeColor="text1"/>
-                <w:sz w:val="16"/>
-                <w:szCs w:val="16"/>
-              </w:rPr>
-            </w:pPr>
-            <w:r>
-              <w:rPr>
-                <w:rFonts w:ascii="Arial" w:hAnsi="Arial"/>
-                <w:bCs/>
+            <w:tcW w:w="2898" w:type="dxa"/>
+          </w:tcPr>
+          <w:p>
+            <w:pPr>
+              <w:rPr>
+                <w:rFonts w:ascii="Arial" w:hAnsi="Arial"/>
+                <w:color w:val="000000" w:themeColor="text1"/>
+                <w:sz w:val="16"/>
+                <w:szCs w:val="16"/>
+              </w:rPr>
+            </w:pPr>
+            <w:r>
+              <w:rPr>
+                <w:rFonts w:ascii="Arial" w:hAnsi="Arial"/>
                 <w:color w:val="000000" w:themeColor="text1"/>
                 <w:sz w:val="16"/>
                 <w:szCs w:val="16"/>
@@ -1153,7 +1168,6 @@
             <w:r>
               <w:rPr>
                 <w:rFonts w:ascii="Arial" w:hAnsi="Arial"/>
-                <w:bCs/>
                 <w:color w:val="000000" w:themeColor="text1"/>
                 <w:sz w:val="16"/>
                 <w:szCs w:val="16"/>
@@ -1163,7 +1177,6 @@
             <w:r>
               <w:rPr>
                 <w:rFonts w:ascii="Arial" w:hAnsi="Arial"/>
-                <w:bCs/>
                 <w:color w:val="000000" w:themeColor="text1"/>
                 <w:sz w:val="16"/>
                 <w:szCs w:val="16"/>
@@ -1173,7 +1186,6 @@
             <w:r>
               <w:rPr>
                 <w:rFonts w:ascii="Arial" w:hAnsi="Arial"/>
-                <w:bCs/>
                 <w:color w:val="000000" w:themeColor="text1"/>
                 <w:sz w:val="16"/>
                 <w:szCs w:val="16"/>
@@ -1183,7 +1195,6 @@
             <w:r>
               <w:rPr>
                 <w:rFonts w:ascii="Arial" w:hAnsi="Arial"/>
-                <w:bCs/>
                 <w:color w:val="000000" w:themeColor="text1"/>
                 <w:sz w:val="16"/>
                 <w:szCs w:val="16"/>
@@ -1193,8 +1204,6 @@
             <w:r>
               <w:rPr>
                 <w:rFonts w:ascii="Arial" w:hAnsi="Arial"/>
-                <w:bCs/>
-                <w:noProof/>
                 <w:color w:val="000000" w:themeColor="text1"/>
                 <w:sz w:val="16"/>
                 <w:szCs w:val="16"/>
@@ -1204,7 +1213,6 @@
             <w:r>
               <w:rPr>
                 <w:rFonts w:ascii="Arial" w:hAnsi="Arial"/>
-                <w:bCs/>
                 <w:color w:val="000000" w:themeColor="text1"/>
                 <w:sz w:val="16"/>
                 <w:szCs w:val="16"/>
@@ -1214,7 +1222,6 @@
             <w:r>
               <w:rPr>
                 <w:rFonts w:ascii="Arial" w:hAnsi="Arial"/>
-                <w:bCs/>
                 <w:color w:val="000000" w:themeColor="text1"/>
                 <w:sz w:val="16"/>
                 <w:szCs w:val="16"/>
@@ -1226,17 +1233,18 @@
       </w:tr>
       <w:tr>
         <w:trPr>
-          <w:trHeight w:val="375"/>
+          <w:trHeight w:val="269"/>
         </w:trPr>
         <w:tc>
           <w:tcPr>
-            <w:tcW w:w="1854" w:type="dxa"/>
-          </w:tcPr>
-          <w:p>
-            <w:pPr>
-              <w:rPr>
-                <w:rFonts w:ascii="Arial" w:hAnsi="Arial"/>
-                <w:b/>
+            <w:tcW w:w="1849" w:type="dxa"/>
+          </w:tcPr>
+          <w:p>
+            <w:pPr>
+              <w:rPr>
+                <w:rFonts w:ascii="Arial" w:hAnsi="Arial"/>
+                <w:b/>
+                <w:bCs/>
                 <w:color w:val="000000" w:themeColor="text1"/>
                 <w:sz w:val="16"/>
                 <w:szCs w:val="16"/>
@@ -1247,6 +1255,7 @@
               <w:rPr>
                 <w:rFonts w:ascii="Arial" w:hAnsi="Arial"/>
                 <w:b/>
+                <w:bCs/>
                 <w:color w:val="000000" w:themeColor="text1"/>
                 <w:sz w:val="16"/>
                 <w:szCs w:val="16"/>
@@ -1258,22 +1267,20 @@
         </w:tc>
         <w:tc>
           <w:tcPr>
-            <w:tcW w:w="3955" w:type="dxa"/>
-          </w:tcPr>
-          <w:p>
-            <w:pPr>
-              <w:rPr>
-                <w:rFonts w:ascii="Arial" w:hAnsi="Arial"/>
-                <w:bCs/>
-                <w:color w:val="000000" w:themeColor="text1"/>
-                <w:sz w:val="16"/>
-                <w:szCs w:val="16"/>
-              </w:rPr>
-            </w:pPr>
-            <w:r>
-              <w:rPr>
-                <w:rFonts w:ascii="Arial" w:hAnsi="Arial"/>
-                <w:bCs/>
+            <w:tcW w:w="3945" w:type="dxa"/>
+          </w:tcPr>
+          <w:p>
+            <w:pPr>
+              <w:rPr>
+                <w:rFonts w:ascii="Arial" w:hAnsi="Arial"/>
+                <w:color w:val="000000" w:themeColor="text1"/>
+                <w:sz w:val="16"/>
+                <w:szCs w:val="16"/>
+              </w:rPr>
+            </w:pPr>
+            <w:r>
+              <w:rPr>
+                <w:rFonts w:ascii="Arial" w:hAnsi="Arial"/>
                 <w:color w:val="000000" w:themeColor="text1"/>
                 <w:sz w:val="16"/>
                 <w:szCs w:val="16"/>
@@ -1283,38 +1290,15 @@
             <w:r>
               <w:rPr>
                 <w:rFonts w:ascii="Arial" w:hAnsi="Arial"/>
-                <w:bCs/>
-                <w:color w:val="000000" w:themeColor="text1"/>
-                <w:sz w:val="16"/>
-                <w:szCs w:val="16"/>
-              </w:rPr>
-              <w:instrText xml:space="preserve"> MERGEFIELD  </w:instrText>
-            </w:r>
-            <w:r>
-              <w:rPr>
-                <w:rFonts w:ascii="Arial" w:hAnsi="Arial"/>
-                <w:bCs/>
-                <w:noProof/>
-                <w:color w:val="000000" w:themeColor="text1"/>
-                <w:sz w:val="16"/>
-                <w:szCs w:val="16"/>
-              </w:rPr>
-              <w:instrText>telefono_empresa</w:instrText>
-            </w:r>
-            <w:r>
-              <w:rPr>
-                <w:rFonts w:ascii="Arial" w:hAnsi="Arial"/>
-                <w:bCs/>
-                <w:color w:val="000000" w:themeColor="text1"/>
-                <w:sz w:val="16"/>
-                <w:szCs w:val="16"/>
-              </w:rPr>
-              <w:instrText xml:space="preserve">  \* MERGEFORMAT </w:instrText>
-            </w:r>
-            <w:r>
-              <w:rPr>
-                <w:rFonts w:ascii="Arial" w:hAnsi="Arial"/>
-                <w:bCs/>
+                <w:color w:val="000000" w:themeColor="text1"/>
+                <w:sz w:val="16"/>
+                <w:szCs w:val="16"/>
+              </w:rPr>
+              <w:instrText xml:space="preserve"> MERGEFIELD  telefono_empresa  \* MERGEFORMAT </w:instrText>
+            </w:r>
+            <w:r>
+              <w:rPr>
+                <w:rFonts w:ascii="Arial" w:hAnsi="Arial"/>
                 <w:color w:val="000000" w:themeColor="text1"/>
                 <w:sz w:val="16"/>
                 <w:szCs w:val="16"/>
@@ -1324,8 +1308,6 @@
             <w:r>
               <w:rPr>
                 <w:rFonts w:ascii="Arial" w:hAnsi="Arial"/>
-                <w:bCs/>
-                <w:noProof/>
                 <w:color w:val="000000" w:themeColor="text1"/>
                 <w:sz w:val="16"/>
                 <w:szCs w:val="16"/>
@@ -1335,7 +1317,6 @@
             <w:r>
               <w:rPr>
                 <w:rFonts w:ascii="Arial" w:hAnsi="Arial"/>
-                <w:bCs/>
                 <w:color w:val="000000" w:themeColor="text1"/>
                 <w:sz w:val="16"/>
                 <w:szCs w:val="16"/>
@@ -1346,13 +1327,12 @@
         </w:tc>
         <w:tc>
           <w:tcPr>
-            <w:tcW w:w="2903" w:type="dxa"/>
-          </w:tcPr>
-          <w:p>
-            <w:pPr>
-              <w:rPr>
-                <w:rFonts w:ascii="Arial" w:hAnsi="Arial"/>
-                <w:b/>
+            <w:tcW w:w="2896" w:type="dxa"/>
+          </w:tcPr>
+          <w:p>
+            <w:pPr>
+              <w:rPr>
+                <w:rFonts w:ascii="Arial" w:hAnsi="Arial"/>
                 <w:color w:val="000000" w:themeColor="text1"/>
                 <w:sz w:val="16"/>
                 <w:szCs w:val="16"/>
@@ -1363,13 +1343,12 @@
         </w:tc>
         <w:tc>
           <w:tcPr>
-            <w:tcW w:w="2904" w:type="dxa"/>
-          </w:tcPr>
-          <w:p>
-            <w:pPr>
-              <w:rPr>
-                <w:rFonts w:ascii="Arial" w:hAnsi="Arial"/>
-                <w:bCs/>
+            <w:tcW w:w="2898" w:type="dxa"/>
+          </w:tcPr>
+          <w:p>
+            <w:pPr>
+              <w:rPr>
+                <w:rFonts w:ascii="Arial" w:hAnsi="Arial"/>
                 <w:color w:val="000000" w:themeColor="text1"/>
                 <w:sz w:val="16"/>
                 <w:szCs w:val="16"/>
@@ -1384,20 +1363,14 @@
         </w:trPr>
         <w:tc>
           <w:tcPr>
-            <w:tcW w:w="5809" w:type="dxa"/>
+            <w:tcW w:w="5794" w:type="dxa"/>
             <w:gridSpan w:val="2"/>
-          </w:tcPr>
-          <w:p>
-            <w:pPr>
-              <w:rPr>
-                <w:rFonts w:ascii="Arial" w:hAnsi="Arial"/>
-                <w:bCs/>
-                <w:color w:val="000000" w:themeColor="text1"/>
-                <w:sz w:val="16"/>
-                <w:szCs w:val="16"/>
-              </w:rPr>
-            </w:pPr>
-            <w:r>
+            <w:tcBorders>
+              <w:bottom w:val="single" w:sz="6" w:space="0" w:color="auto"/>
+            </w:tcBorders>
+          </w:tcPr>
+          <w:p>
+            <w:pPr>
               <w:rPr>
                 <w:rFonts w:ascii="Arial" w:hAnsi="Arial"/>
                 <w:b/>
@@ -1408,525 +1381,229 @@
                 <w:u w:val="single"/>
                 <w:lang w:val="es-PE"/>
               </w:rPr>
-              <w:t>Información</w:t>
-            </w:r>
-            <w:r>
-              <w:rPr>
-                <w:rFonts w:ascii="Arial" w:hAnsi="Arial"/>
-                <w:b/>
-                <w:bCs/>
+            </w:pPr>
+          </w:p>
+        </w:tc>
+        <w:tc>
+          <w:tcPr>
+            <w:tcW w:w="5794" w:type="dxa"/>
+            <w:gridSpan w:val="2"/>
+            <w:tcBorders>
+              <w:bottom w:val="single" w:sz="6" w:space="0" w:color="auto"/>
+            </w:tcBorders>
+          </w:tcPr>
+          <w:p>
+            <w:pPr>
+              <w:rPr>
+                <w:rFonts w:ascii="Arial" w:hAnsi="Arial"/>
+                <w:b/>
                 <w:color w:val="000000" w:themeColor="text1"/>
                 <w:sz w:val="16"/>
                 <w:szCs w:val="16"/>
                 <w:u w:val="single"/>
-                <w:lang w:val="es-PE"/>
-              </w:rPr>
-              <w:t xml:space="preserve"> Comercial</w:t>
-            </w:r>
-          </w:p>
-        </w:tc>
-        <w:tc>
-          <w:tcPr>
-            <w:tcW w:w="5808" w:type="dxa"/>
-            <w:gridSpan w:val="2"/>
-          </w:tcPr>
-          <w:p>
-            <w:pPr>
-              <w:rPr>
-                <w:rFonts w:ascii="Arial" w:hAnsi="Arial"/>
-                <w:b/>
-                <w:color w:val="000000" w:themeColor="text1"/>
-                <w:sz w:val="16"/>
-                <w:szCs w:val="16"/>
-                <w:u w:val="single"/>
-              </w:rPr>
-            </w:pPr>
-            <w:r>
-              <w:rPr>
-                <w:rFonts w:ascii="Arial" w:hAnsi="Arial"/>
-                <w:b/>
-                <w:color w:val="000000" w:themeColor="text1"/>
-                <w:sz w:val="16"/>
-                <w:szCs w:val="16"/>
-                <w:u w:val="single"/>
-              </w:rPr>
-              <w:t>Información</w:t>
-            </w:r>
-            <w:r>
-              <w:rPr>
-                <w:rFonts w:ascii="Arial" w:hAnsi="Arial"/>
-                <w:b/>
-                <w:color w:val="000000" w:themeColor="text1"/>
-                <w:sz w:val="16"/>
-                <w:szCs w:val="16"/>
-                <w:u w:val="single"/>
-              </w:rPr>
-              <w:t xml:space="preserve"> Transportista</w:t>
-            </w:r>
+              </w:rPr>
+            </w:pPr>
           </w:p>
         </w:tc>
       </w:tr>
       <w:tr>
         <w:trPr>
-          <w:trHeight w:val="454"/>
+          <w:trHeight w:val="201"/>
         </w:trPr>
         <w:tc>
           <w:tcPr>
-            <w:tcW w:w="1854" w:type="dxa"/>
-          </w:tcPr>
-          <w:p>
-            <w:pPr>
-              <w:rPr>
-                <w:rFonts w:ascii="Arial" w:hAnsi="Arial"/>
-                <w:bCs/>
-                <w:color w:val="000000" w:themeColor="text1"/>
-                <w:sz w:val="16"/>
-                <w:szCs w:val="16"/>
-              </w:rPr>
-            </w:pPr>
-            <w:r>
-              <w:rPr>
-                <w:rFonts w:ascii="Arial" w:hAnsi="Arial"/>
-                <w:b/>
-                <w:color w:val="000000" w:themeColor="text1"/>
-                <w:sz w:val="16"/>
-                <w:szCs w:val="16"/>
+            <w:tcW w:w="5794" w:type="dxa"/>
+            <w:gridSpan w:val="2"/>
+            <w:tcBorders>
+              <w:top w:val="single" w:sz="6" w:space="0" w:color="auto"/>
+            </w:tcBorders>
+          </w:tcPr>
+          <w:p>
+            <w:pPr>
+              <w:rPr>
+                <w:rFonts w:ascii="Arial" w:hAnsi="Arial"/>
+                <w:b/>
+                <w:bCs/>
+                <w:color w:val="000000" w:themeColor="text1"/>
+                <w:sz w:val="16"/>
+                <w:szCs w:val="16"/>
+                <w:u w:val="single"/>
                 <w:lang w:val="es-PE"/>
               </w:rPr>
-              <w:t>P</w:t>
-            </w:r>
-            <w:r>
-              <w:rPr>
-                <w:rFonts w:ascii="Arial" w:hAnsi="Arial"/>
-                <w:b/>
-                <w:color w:val="000000" w:themeColor="text1"/>
-                <w:sz w:val="16"/>
-                <w:szCs w:val="16"/>
-                <w:lang w:val="es-PE"/>
-              </w:rPr>
-              <w:t>roveedor</w:t>
-            </w:r>
-          </w:p>
-        </w:tc>
-        <w:tc>
-          <w:tcPr>
-            <w:tcW w:w="3955" w:type="dxa"/>
-          </w:tcPr>
-          <w:p>
-            <w:pPr>
-              <w:rPr>
-                <w:rFonts w:ascii="Arial" w:hAnsi="Arial"/>
-                <w:bCs/>
-                <w:color w:val="000000" w:themeColor="text1"/>
-                <w:sz w:val="16"/>
-                <w:szCs w:val="16"/>
-              </w:rPr>
-            </w:pPr>
-            <w:r>
-              <w:rPr>
-                <w:rFonts w:ascii="Arial" w:hAnsi="Arial"/>
-                <w:bCs/>
-                <w:noProof/>
-                <w:color w:val="000000" w:themeColor="text1"/>
-                <w:sz w:val="16"/>
-                <w:szCs w:val="16"/>
-              </w:rPr>
-              <w:fldChar w:fldCharType="begin"/>
-            </w:r>
-            <w:r>
-              <w:rPr>
-                <w:rFonts w:ascii="Arial" w:hAnsi="Arial"/>
-                <w:bCs/>
-                <w:noProof/>
-                <w:color w:val="000000" w:themeColor="text1"/>
-                <w:sz w:val="16"/>
-                <w:szCs w:val="16"/>
-              </w:rPr>
-              <w:instrText xml:space="preserve"> MERGEFIELD  razon_social  \* MERGEFORMAT </w:instrText>
-            </w:r>
-            <w:r>
-              <w:rPr>
-                <w:rFonts w:ascii="Arial" w:hAnsi="Arial"/>
-                <w:bCs/>
-                <w:noProof/>
-                <w:color w:val="000000" w:themeColor="text1"/>
-                <w:sz w:val="16"/>
-                <w:szCs w:val="16"/>
-              </w:rPr>
-              <w:fldChar w:fldCharType="separate"/>
-            </w:r>
-            <w:r>
-              <w:rPr>
-                <w:rFonts w:ascii="Arial" w:hAnsi="Arial"/>
-                <w:bCs/>
-                <w:noProof/>
-                <w:color w:val="000000" w:themeColor="text1"/>
-                <w:sz w:val="16"/>
-                <w:szCs w:val="16"/>
-              </w:rPr>
-              <w:t>«razon_social»</w:t>
-            </w:r>
-            <w:r>
-              <w:rPr>
-                <w:rFonts w:ascii="Arial" w:hAnsi="Arial"/>
-                <w:bCs/>
-                <w:noProof/>
-                <w:color w:val="000000" w:themeColor="text1"/>
-                <w:sz w:val="16"/>
-                <w:szCs w:val="16"/>
-              </w:rPr>
-              <w:fldChar w:fldCharType="end"/>
-            </w:r>
-          </w:p>
-        </w:tc>
-        <w:tc>
-          <w:tcPr>
-            <w:tcW w:w="2903" w:type="dxa"/>
-          </w:tcPr>
-          <w:p>
-            <w:pPr>
-              <w:rPr>
-                <w:rFonts w:ascii="Arial" w:hAnsi="Arial"/>
-                <w:bCs/>
-                <w:color w:val="000000" w:themeColor="text1"/>
-                <w:sz w:val="16"/>
-                <w:szCs w:val="16"/>
-              </w:rPr>
-            </w:pPr>
-            <w:r>
-              <w:rPr>
-                <w:rFonts w:ascii="Arial" w:hAnsi="Arial"/>
-                <w:b/>
-                <w:color w:val="000000" w:themeColor="text1"/>
-                <w:sz w:val="16"/>
-                <w:szCs w:val="16"/>
-                <w:lang w:val="es-PE"/>
-              </w:rPr>
-              <w:t>Nombre(s)</w:t>
-            </w:r>
-          </w:p>
-        </w:tc>
-        <w:tc>
-          <w:tcPr>
-            <w:tcW w:w="2904" w:type="dxa"/>
-          </w:tcPr>
-          <w:p>
-            <w:pPr>
-              <w:rPr>
-                <w:rFonts w:ascii="Arial" w:hAnsi="Arial"/>
-                <w:bCs/>
-                <w:color w:val="000000" w:themeColor="text1"/>
-                <w:sz w:val="16"/>
-                <w:szCs w:val="16"/>
-              </w:rPr>
-            </w:pPr>
-            <w:r>
-              <w:rPr>
-                <w:rFonts w:ascii="Arial" w:hAnsi="Arial"/>
-                <w:bCs/>
-                <w:color w:val="000000" w:themeColor="text1"/>
-                <w:sz w:val="16"/>
-                <w:szCs w:val="16"/>
-              </w:rPr>
-              <w:fldChar w:fldCharType="begin"/>
-            </w:r>
-            <w:r>
-              <w:rPr>
-                <w:rFonts w:ascii="Arial" w:hAnsi="Arial"/>
-                <w:bCs/>
-                <w:color w:val="000000" w:themeColor="text1"/>
-                <w:sz w:val="16"/>
-                <w:szCs w:val="16"/>
-              </w:rPr>
-              <w:instrText xml:space="preserve"> MERGEFIELD  nom_conductor  \* MERGEFORMAT </w:instrText>
-            </w:r>
-            <w:r>
-              <w:rPr>
-                <w:rFonts w:ascii="Arial" w:hAnsi="Arial"/>
-                <w:bCs/>
-                <w:color w:val="000000" w:themeColor="text1"/>
-                <w:sz w:val="16"/>
-                <w:szCs w:val="16"/>
-              </w:rPr>
-              <w:fldChar w:fldCharType="separate"/>
-            </w:r>
-            <w:r>
-              <w:rPr>
-                <w:rFonts w:ascii="Arial" w:hAnsi="Arial"/>
-                <w:bCs/>
-                <w:noProof/>
-                <w:color w:val="000000" w:themeColor="text1"/>
-                <w:sz w:val="16"/>
-                <w:szCs w:val="16"/>
-              </w:rPr>
-              <w:t>«nom_conductor»</w:t>
-            </w:r>
-            <w:r>
-              <w:rPr>
-                <w:rFonts w:ascii="Arial" w:hAnsi="Arial"/>
-                <w:bCs/>
-                <w:color w:val="000000" w:themeColor="text1"/>
-                <w:sz w:val="16"/>
-                <w:szCs w:val="16"/>
-              </w:rPr>
-              <w:fldChar w:fldCharType="end"/>
-            </w:r>
+            </w:pPr>
+          </w:p>
+        </w:tc>
+        <w:tc>
+          <w:tcPr>
+            <w:tcW w:w="5794" w:type="dxa"/>
+            <w:gridSpan w:val="2"/>
+            <w:tcBorders>
+              <w:top w:val="single" w:sz="6" w:space="0" w:color="auto"/>
+            </w:tcBorders>
+          </w:tcPr>
+          <w:p>
+            <w:pPr>
+              <w:rPr>
+                <w:rFonts w:ascii="Arial" w:hAnsi="Arial"/>
+                <w:b/>
+                <w:color w:val="000000" w:themeColor="text1"/>
+                <w:sz w:val="16"/>
+                <w:szCs w:val="16"/>
+                <w:u w:val="single"/>
+              </w:rPr>
+            </w:pPr>
           </w:p>
         </w:tc>
       </w:tr>
       <w:tr>
         <w:trPr>
-          <w:trHeight w:val="434"/>
+          <w:trHeight w:val="201"/>
         </w:trPr>
         <w:tc>
           <w:tcPr>
-            <w:tcW w:w="1854" w:type="dxa"/>
-          </w:tcPr>
-          <w:p>
-            <w:pPr>
-              <w:rPr>
-                <w:rFonts w:ascii="Arial" w:hAnsi="Arial"/>
-                <w:bCs/>
-                <w:color w:val="000000" w:themeColor="text1"/>
-                <w:sz w:val="16"/>
-                <w:szCs w:val="16"/>
-              </w:rPr>
-            </w:pPr>
-            <w:r>
-              <w:rPr>
-                <w:rFonts w:ascii="Arial" w:hAnsi="Arial"/>
-                <w:b/>
-                <w:color w:val="000000" w:themeColor="text1"/>
-                <w:sz w:val="16"/>
-                <w:szCs w:val="16"/>
+            <w:tcW w:w="5794" w:type="dxa"/>
+            <w:gridSpan w:val="2"/>
+          </w:tcPr>
+          <w:p>
+            <w:pPr>
+              <w:rPr>
+                <w:rFonts w:ascii="Arial" w:hAnsi="Arial"/>
+                <w:bCs/>
+                <w:color w:val="000000" w:themeColor="text1"/>
+                <w:sz w:val="16"/>
+                <w:szCs w:val="16"/>
+              </w:rPr>
+            </w:pPr>
+            <w:r>
+              <w:rPr>
+                <w:rFonts w:ascii="Arial" w:hAnsi="Arial"/>
+                <w:b/>
+                <w:bCs/>
+                <w:color w:val="000000" w:themeColor="text1"/>
+                <w:sz w:val="16"/>
+                <w:szCs w:val="16"/>
+                <w:u w:val="single"/>
                 <w:lang w:val="es-PE"/>
               </w:rPr>
-              <w:t>RUC</w:t>
-            </w:r>
-            <w:r>
-              <w:rPr>
-                <w:rFonts w:ascii="Arial" w:hAnsi="Arial"/>
-                <w:b/>
-                <w:color w:val="000000" w:themeColor="text1"/>
-                <w:sz w:val="16"/>
-                <w:szCs w:val="16"/>
+              <w:t>Información</w:t>
+            </w:r>
+            <w:r>
+              <w:rPr>
+                <w:rFonts w:ascii="Arial" w:hAnsi="Arial"/>
+                <w:b/>
+                <w:bCs/>
+                <w:color w:val="000000" w:themeColor="text1"/>
+                <w:sz w:val="16"/>
+                <w:szCs w:val="16"/>
+                <w:u w:val="single"/>
                 <w:lang w:val="es-PE"/>
               </w:rPr>
-              <w:t xml:space="preserve"> </w:t>
-            </w:r>
-          </w:p>
-        </w:tc>
-        <w:tc>
-          <w:tcPr>
-            <w:tcW w:w="3955" w:type="dxa"/>
-          </w:tcPr>
-          <w:p>
-            <w:pPr>
-              <w:rPr>
-                <w:rFonts w:ascii="Arial" w:hAnsi="Arial"/>
-                <w:bCs/>
-                <w:color w:val="000000" w:themeColor="text1"/>
-                <w:sz w:val="16"/>
-                <w:szCs w:val="16"/>
-              </w:rPr>
-            </w:pPr>
-            <w:r>
-              <w:rPr>
-                <w:rFonts w:ascii="Arial" w:hAnsi="Arial"/>
-                <w:bCs/>
-                <w:color w:val="000000" w:themeColor="text1"/>
-                <w:sz w:val="16"/>
-                <w:szCs w:val="16"/>
-              </w:rPr>
-              <w:fldChar w:fldCharType="begin"/>
-            </w:r>
-            <w:r>
-              <w:rPr>
-                <w:rFonts w:ascii="Arial" w:hAnsi="Arial"/>
-                <w:bCs/>
-                <w:color w:val="000000" w:themeColor="text1"/>
-                <w:sz w:val="16"/>
-                <w:szCs w:val="16"/>
-              </w:rPr>
-              <w:instrText xml:space="preserve"> MERGEFIELD  nro_documento  \* MERGEFORMAT </w:instrText>
-            </w:r>
-            <w:r>
-              <w:rPr>
-                <w:rFonts w:ascii="Arial" w:hAnsi="Arial"/>
-                <w:bCs/>
-                <w:color w:val="000000" w:themeColor="text1"/>
-                <w:sz w:val="16"/>
-                <w:szCs w:val="16"/>
-              </w:rPr>
-              <w:fldChar w:fldCharType="separate"/>
-            </w:r>
-            <w:r>
-              <w:rPr>
-                <w:rFonts w:ascii="Arial" w:hAnsi="Arial"/>
-                <w:bCs/>
-                <w:noProof/>
-                <w:color w:val="000000" w:themeColor="text1"/>
-                <w:sz w:val="16"/>
-                <w:szCs w:val="16"/>
-              </w:rPr>
-              <w:t>«nro_documento»</w:t>
-            </w:r>
-            <w:r>
-              <w:rPr>
-                <w:rFonts w:ascii="Arial" w:hAnsi="Arial"/>
-                <w:bCs/>
-                <w:color w:val="000000" w:themeColor="text1"/>
-                <w:sz w:val="16"/>
-                <w:szCs w:val="16"/>
-              </w:rPr>
-              <w:fldChar w:fldCharType="end"/>
-            </w:r>
-          </w:p>
-        </w:tc>
-        <w:tc>
-          <w:tcPr>
-            <w:tcW w:w="2903" w:type="dxa"/>
-          </w:tcPr>
-          <w:p>
-            <w:pPr>
-              <w:rPr>
-                <w:rFonts w:ascii="Arial" w:hAnsi="Arial"/>
-                <w:bCs/>
-                <w:color w:val="000000" w:themeColor="text1"/>
-                <w:sz w:val="16"/>
-                <w:szCs w:val="16"/>
-              </w:rPr>
-            </w:pPr>
-            <w:r>
-              <w:rPr>
-                <w:rFonts w:ascii="Arial" w:hAnsi="Arial"/>
-                <w:b/>
-                <w:color w:val="000000" w:themeColor="text1"/>
-                <w:sz w:val="16"/>
-                <w:szCs w:val="16"/>
-                <w:lang w:val="es-PE"/>
-              </w:rPr>
-              <w:t>Empresa</w:t>
-            </w:r>
-          </w:p>
-        </w:tc>
-        <w:tc>
-          <w:tcPr>
-            <w:tcW w:w="2904" w:type="dxa"/>
-          </w:tcPr>
-          <w:p>
-            <w:pPr>
-              <w:rPr>
-                <w:rFonts w:ascii="Arial" w:hAnsi="Arial"/>
-                <w:bCs/>
-                <w:color w:val="000000" w:themeColor="text1"/>
-                <w:sz w:val="16"/>
-                <w:szCs w:val="16"/>
-              </w:rPr>
-            </w:pPr>
-            <w:r>
-              <w:rPr>
-                <w:rFonts w:ascii="Arial" w:hAnsi="Arial"/>
-                <w:bCs/>
-                <w:color w:val="000000" w:themeColor="text1"/>
-                <w:sz w:val="16"/>
-                <w:szCs w:val="16"/>
-              </w:rPr>
-              <w:fldChar w:fldCharType="begin"/>
-            </w:r>
-            <w:r>
-              <w:rPr>
-                <w:rFonts w:ascii="Arial" w:hAnsi="Arial"/>
-                <w:bCs/>
-                <w:color w:val="000000" w:themeColor="text1"/>
-                <w:sz w:val="16"/>
-                <w:szCs w:val="16"/>
-              </w:rPr>
-              <w:instrText xml:space="preserve"> MERGEFIELD  nom_transportista  \* MERGEFORMAT </w:instrText>
-            </w:r>
-            <w:r>
-              <w:rPr>
-                <w:rFonts w:ascii="Arial" w:hAnsi="Arial"/>
-                <w:bCs/>
-                <w:color w:val="000000" w:themeColor="text1"/>
-                <w:sz w:val="16"/>
-                <w:szCs w:val="16"/>
-              </w:rPr>
-              <w:fldChar w:fldCharType="separate"/>
-            </w:r>
-            <w:r>
-              <w:rPr>
-                <w:rFonts w:ascii="Arial" w:hAnsi="Arial"/>
-                <w:bCs/>
-                <w:noProof/>
-                <w:color w:val="000000" w:themeColor="text1"/>
-                <w:sz w:val="16"/>
-                <w:szCs w:val="16"/>
-              </w:rPr>
-              <w:t>«nom_transportista»</w:t>
-            </w:r>
-            <w:r>
-              <w:rPr>
-                <w:rFonts w:ascii="Arial" w:hAnsi="Arial"/>
-                <w:bCs/>
-                <w:color w:val="000000" w:themeColor="text1"/>
-                <w:sz w:val="16"/>
-                <w:szCs w:val="16"/>
-              </w:rPr>
-              <w:fldChar w:fldCharType="end"/>
+              <w:t xml:space="preserve"> Comercial</w:t>
+            </w:r>
+          </w:p>
+        </w:tc>
+        <w:tc>
+          <w:tcPr>
+            <w:tcW w:w="5794" w:type="dxa"/>
+            <w:gridSpan w:val="2"/>
+          </w:tcPr>
+          <w:p>
+            <w:pPr>
+              <w:rPr>
+                <w:rFonts w:ascii="Arial" w:hAnsi="Arial"/>
+                <w:b/>
+                <w:color w:val="000000" w:themeColor="text1"/>
+                <w:sz w:val="16"/>
+                <w:szCs w:val="16"/>
+                <w:u w:val="single"/>
+              </w:rPr>
+            </w:pPr>
+            <w:r>
+              <w:rPr>
+                <w:rFonts w:ascii="Arial" w:hAnsi="Arial"/>
+                <w:b/>
+                <w:color w:val="000000" w:themeColor="text1"/>
+                <w:sz w:val="16"/>
+                <w:szCs w:val="16"/>
+                <w:u w:val="single"/>
+              </w:rPr>
+              <w:t>Información</w:t>
+            </w:r>
+            <w:r>
+              <w:rPr>
+                <w:rFonts w:ascii="Arial" w:hAnsi="Arial"/>
+                <w:b/>
+                <w:color w:val="000000" w:themeColor="text1"/>
+                <w:sz w:val="16"/>
+                <w:szCs w:val="16"/>
+                <w:u w:val="single"/>
+              </w:rPr>
+              <w:t xml:space="preserve"> Transportista</w:t>
             </w:r>
           </w:p>
         </w:tc>
       </w:tr>
       <w:tr>
         <w:trPr>
-          <w:trHeight w:val="390"/>
+          <w:trHeight w:val="212"/>
         </w:trPr>
         <w:tc>
           <w:tcPr>
-            <w:tcW w:w="1854" w:type="dxa"/>
-          </w:tcPr>
-          <w:p>
-            <w:pPr>
-              <w:rPr>
-                <w:rFonts w:ascii="Arial" w:hAnsi="Arial"/>
-                <w:bCs/>
-                <w:color w:val="000000" w:themeColor="text1"/>
-                <w:sz w:val="16"/>
-                <w:szCs w:val="16"/>
-              </w:rPr>
-            </w:pPr>
-            <w:r>
-              <w:rPr>
-                <w:rFonts w:ascii="Arial" w:hAnsi="Arial"/>
-                <w:b/>
+            <w:tcW w:w="1849" w:type="dxa"/>
+          </w:tcPr>
+          <w:p>
+            <w:pPr>
+              <w:rPr>
+                <w:rFonts w:ascii="Arial" w:hAnsi="Arial"/>
+                <w:b/>
+                <w:bCs/>
+                <w:color w:val="000000" w:themeColor="text1"/>
+                <w:sz w:val="16"/>
+                <w:szCs w:val="16"/>
+              </w:rPr>
+            </w:pPr>
+            <w:r>
+              <w:rPr>
+                <w:rFonts w:ascii="Arial" w:hAnsi="Arial"/>
+                <w:b/>
+                <w:bCs/>
                 <w:color w:val="000000" w:themeColor="text1"/>
                 <w:sz w:val="16"/>
                 <w:szCs w:val="16"/>
                 <w:lang w:val="es-PE"/>
               </w:rPr>
-              <w:t>N° Doc / Guia R.</w:t>
-            </w:r>
-          </w:p>
-        </w:tc>
-        <w:tc>
-          <w:tcPr>
-            <w:tcW w:w="3955" w:type="dxa"/>
-          </w:tcPr>
-          <w:p>
-            <w:pPr>
-              <w:rPr>
-                <w:rFonts w:ascii="Arial" w:hAnsi="Arial"/>
-                <w:bCs/>
-                <w:color w:val="000000" w:themeColor="text1"/>
-                <w:sz w:val="16"/>
-                <w:szCs w:val="16"/>
-              </w:rPr>
-            </w:pPr>
-            <w:r>
-              <w:rPr>
-                <w:rFonts w:ascii="Arial" w:hAnsi="Arial"/>
-                <w:bCs/>
+              <w:t>P</w:t>
+            </w:r>
+            <w:r>
+              <w:rPr>
+                <w:rFonts w:ascii="Arial" w:hAnsi="Arial"/>
+                <w:b/>
+                <w:bCs/>
+                <w:color w:val="000000" w:themeColor="text1"/>
+                <w:sz w:val="16"/>
+                <w:szCs w:val="16"/>
+                <w:lang w:val="es-PE"/>
+              </w:rPr>
+              <w:t>roveedor</w:t>
+            </w:r>
+          </w:p>
+        </w:tc>
+        <w:tc>
+          <w:tcPr>
+            <w:tcW w:w="3945" w:type="dxa"/>
+          </w:tcPr>
+          <w:p>
+            <w:pPr>
+              <w:rPr>
+                <w:rFonts w:ascii="Arial" w:hAnsi="Arial"/>
+                <w:color w:val="000000" w:themeColor="text1"/>
+                <w:sz w:val="16"/>
+                <w:szCs w:val="16"/>
+              </w:rPr>
+            </w:pPr>
+            <w:r>
+              <w:rPr>
+                <w:rFonts w:ascii="Arial" w:hAnsi="Arial"/>
                 <w:color w:val="000000" w:themeColor="text1"/>
                 <w:sz w:val="16"/>
                 <w:szCs w:val="16"/>
@@ -1936,17 +1613,15 @@
             <w:r>
               <w:rPr>
                 <w:rFonts w:ascii="Arial" w:hAnsi="Arial"/>
-                <w:bCs/>
-                <w:color w:val="000000" w:themeColor="text1"/>
-                <w:sz w:val="16"/>
-                <w:szCs w:val="16"/>
-              </w:rPr>
-              <w:instrText xml:space="preserve"> MERGEFIELD  guia_re  \* MERGEFORMAT </w:instrText>
-            </w:r>
-            <w:r>
-              <w:rPr>
-                <w:rFonts w:ascii="Arial" w:hAnsi="Arial"/>
-                <w:bCs/>
+                <w:color w:val="000000" w:themeColor="text1"/>
+                <w:sz w:val="16"/>
+                <w:szCs w:val="16"/>
+              </w:rPr>
+              <w:instrText xml:space="preserve"> MERGEFIELD  razon_social  \* MERGEFORMAT </w:instrText>
+            </w:r>
+            <w:r>
+              <w:rPr>
+                <w:rFonts w:ascii="Arial" w:hAnsi="Arial"/>
                 <w:color w:val="000000" w:themeColor="text1"/>
                 <w:sz w:val="16"/>
                 <w:szCs w:val="16"/>
@@ -1956,18 +1631,15 @@
             <w:r>
               <w:rPr>
                 <w:rFonts w:ascii="Arial" w:hAnsi="Arial"/>
-                <w:bCs/>
-                <w:noProof/>
-                <w:color w:val="000000" w:themeColor="text1"/>
-                <w:sz w:val="16"/>
-                <w:szCs w:val="16"/>
-              </w:rPr>
-              <w:t>«guia_re»</w:t>
-            </w:r>
-            <w:r>
-              <w:rPr>
-                <w:rFonts w:ascii="Arial" w:hAnsi="Arial"/>
-                <w:bCs/>
+                <w:color w:val="000000" w:themeColor="text1"/>
+                <w:sz w:val="16"/>
+                <w:szCs w:val="16"/>
+              </w:rPr>
+              <w:t>«razon_social»</w:t>
+            </w:r>
+            <w:r>
+              <w:rPr>
+                <w:rFonts w:ascii="Arial" w:hAnsi="Arial"/>
                 <w:color w:val="000000" w:themeColor="text1"/>
                 <w:sz w:val="16"/>
                 <w:szCs w:val="16"/>
@@ -1978,49 +1650,49 @@
         </w:tc>
         <w:tc>
           <w:tcPr>
-            <w:tcW w:w="2903" w:type="dxa"/>
-          </w:tcPr>
-          <w:p>
-            <w:pPr>
-              <w:rPr>
-                <w:rFonts w:ascii="Arial" w:hAnsi="Arial"/>
-                <w:bCs/>
-                <w:color w:val="000000" w:themeColor="text1"/>
-                <w:sz w:val="16"/>
-                <w:szCs w:val="16"/>
-              </w:rPr>
-            </w:pPr>
-            <w:r>
-              <w:rPr>
-                <w:rFonts w:ascii="Arial" w:hAnsi="Arial"/>
-                <w:b/>
+            <w:tcW w:w="2896" w:type="dxa"/>
+          </w:tcPr>
+          <w:p>
+            <w:pPr>
+              <w:rPr>
+                <w:rFonts w:ascii="Arial" w:hAnsi="Arial"/>
+                <w:b/>
+                <w:bCs/>
+                <w:color w:val="000000" w:themeColor="text1"/>
+                <w:sz w:val="16"/>
+                <w:szCs w:val="16"/>
+              </w:rPr>
+            </w:pPr>
+            <w:r>
+              <w:rPr>
+                <w:rFonts w:ascii="Arial" w:hAnsi="Arial"/>
+                <w:b/>
+                <w:bCs/>
                 <w:color w:val="000000" w:themeColor="text1"/>
                 <w:sz w:val="16"/>
                 <w:szCs w:val="16"/>
                 <w:lang w:val="es-PE"/>
               </w:rPr>
-              <w:t>Ruc</w:t>
-            </w:r>
-          </w:p>
-        </w:tc>
-        <w:tc>
-          <w:tcPr>
-            <w:tcW w:w="2904" w:type="dxa"/>
-          </w:tcPr>
-          <w:p>
-            <w:pPr>
-              <w:rPr>
-                <w:rFonts w:ascii="Arial" w:hAnsi="Arial"/>
-                <w:bCs/>
-                <w:color w:val="000000" w:themeColor="text1"/>
-                <w:sz w:val="16"/>
-                <w:szCs w:val="16"/>
-              </w:rPr>
-            </w:pPr>
-            <w:r>
-              <w:rPr>
-                <w:rFonts w:ascii="Arial" w:hAnsi="Arial"/>
-                <w:bCs/>
+              <w:t>Nombre(s)</w:t>
+            </w:r>
+          </w:p>
+        </w:tc>
+        <w:tc>
+          <w:tcPr>
+            <w:tcW w:w="2898" w:type="dxa"/>
+          </w:tcPr>
+          <w:p>
+            <w:pPr>
+              <w:rPr>
+                <w:rFonts w:ascii="Arial" w:hAnsi="Arial"/>
+                <w:color w:val="000000" w:themeColor="text1"/>
+                <w:sz w:val="16"/>
+                <w:szCs w:val="16"/>
+              </w:rPr>
+            </w:pPr>
+            <w:r>
+              <w:rPr>
+                <w:rFonts w:ascii="Arial" w:hAnsi="Arial"/>
                 <w:color w:val="000000" w:themeColor="text1"/>
                 <w:sz w:val="16"/>
                 <w:szCs w:val="16"/>
@@ -2030,17 +1702,15 @@
             <w:r>
               <w:rPr>
                 <w:rFonts w:ascii="Arial" w:hAnsi="Arial"/>
-                <w:bCs/>
-                <w:color w:val="000000" w:themeColor="text1"/>
-                <w:sz w:val="16"/>
-                <w:szCs w:val="16"/>
-              </w:rPr>
-              <w:instrText xml:space="preserve"> MERGEFIELD  ruc_trans  \* MERGEFORMAT </w:instrText>
-            </w:r>
-            <w:r>
-              <w:rPr>
-                <w:rFonts w:ascii="Arial" w:hAnsi="Arial"/>
-                <w:bCs/>
+                <w:color w:val="000000" w:themeColor="text1"/>
+                <w:sz w:val="16"/>
+                <w:szCs w:val="16"/>
+              </w:rPr>
+              <w:instrText xml:space="preserve"> MERGEFIELD  nom_conductor  \* MERGEFORMAT </w:instrText>
+            </w:r>
+            <w:r>
+              <w:rPr>
+                <w:rFonts w:ascii="Arial" w:hAnsi="Arial"/>
                 <w:color w:val="000000" w:themeColor="text1"/>
                 <w:sz w:val="16"/>
                 <w:szCs w:val="16"/>
@@ -2050,18 +1720,15 @@
             <w:r>
               <w:rPr>
                 <w:rFonts w:ascii="Arial" w:hAnsi="Arial"/>
-                <w:bCs/>
-                <w:noProof/>
-                <w:color w:val="000000" w:themeColor="text1"/>
-                <w:sz w:val="16"/>
-                <w:szCs w:val="16"/>
-              </w:rPr>
-              <w:t>«ruc_trans»</w:t>
-            </w:r>
-            <w:r>
-              <w:rPr>
-                <w:rFonts w:ascii="Arial" w:hAnsi="Arial"/>
-                <w:bCs/>
+                <w:color w:val="000000" w:themeColor="text1"/>
+                <w:sz w:val="16"/>
+                <w:szCs w:val="16"/>
+              </w:rPr>
+              <w:t>«nom_conductor»</w:t>
+            </w:r>
+            <w:r>
+              <w:rPr>
+                <w:rFonts w:ascii="Arial" w:hAnsi="Arial"/>
                 <w:color w:val="000000" w:themeColor="text1"/>
                 <w:sz w:val="16"/>
                 <w:szCs w:val="16"/>
@@ -2073,87 +1740,477 @@
       </w:tr>
       <w:tr>
         <w:trPr>
-          <w:trHeight w:val="280"/>
+          <w:trHeight w:val="243"/>
         </w:trPr>
         <w:tc>
           <w:tcPr>
-            <w:tcW w:w="1854" w:type="dxa"/>
-          </w:tcPr>
-          <w:p>
-            <w:pPr>
-              <w:rPr>
-                <w:rFonts w:ascii="Arial" w:hAnsi="Arial"/>
-                <w:b/>
+            <w:tcW w:w="1849" w:type="dxa"/>
+          </w:tcPr>
+          <w:p>
+            <w:pPr>
+              <w:rPr>
+                <w:rFonts w:ascii="Arial" w:hAnsi="Arial"/>
+                <w:b/>
+                <w:bCs/>
+                <w:color w:val="000000" w:themeColor="text1"/>
+                <w:sz w:val="16"/>
+                <w:szCs w:val="16"/>
+              </w:rPr>
+            </w:pPr>
+            <w:r>
+              <w:rPr>
+                <w:rFonts w:ascii="Arial" w:hAnsi="Arial"/>
+                <w:b/>
+                <w:bCs/>
                 <w:color w:val="000000" w:themeColor="text1"/>
                 <w:sz w:val="16"/>
                 <w:szCs w:val="16"/>
                 <w:lang w:val="es-PE"/>
               </w:rPr>
-            </w:pPr>
-          </w:p>
-        </w:tc>
-        <w:tc>
-          <w:tcPr>
-            <w:tcW w:w="3955" w:type="dxa"/>
-          </w:tcPr>
-          <w:p>
-            <w:pPr>
-              <w:rPr>
-                <w:rFonts w:ascii="Arial" w:hAnsi="Arial"/>
-                <w:bCs/>
-                <w:color w:val="000000" w:themeColor="text1"/>
-                <w:sz w:val="16"/>
-                <w:szCs w:val="16"/>
-              </w:rPr>
-            </w:pPr>
-          </w:p>
-        </w:tc>
-        <w:tc>
-          <w:tcPr>
-            <w:tcW w:w="2903" w:type="dxa"/>
-          </w:tcPr>
-          <w:p>
-            <w:pPr>
-              <w:rPr>
-                <w:rFonts w:ascii="Arial" w:hAnsi="Arial"/>
-                <w:b/>
+              <w:t>RUC</w:t>
+            </w:r>
+            <w:r>
+              <w:rPr>
+                <w:rFonts w:ascii="Arial" w:hAnsi="Arial"/>
+                <w:b/>
+                <w:bCs/>
                 <w:color w:val="000000" w:themeColor="text1"/>
                 <w:sz w:val="16"/>
                 <w:szCs w:val="16"/>
                 <w:lang w:val="es-PE"/>
               </w:rPr>
-            </w:pPr>
-            <w:r>
-              <w:rPr>
-                <w:rFonts w:ascii="Arial" w:hAnsi="Arial"/>
-                <w:b/>
+              <w:t xml:space="preserve"> </w:t>
+            </w:r>
+          </w:p>
+        </w:tc>
+        <w:tc>
+          <w:tcPr>
+            <w:tcW w:w="3945" w:type="dxa"/>
+          </w:tcPr>
+          <w:p>
+            <w:pPr>
+              <w:rPr>
+                <w:rFonts w:ascii="Arial" w:hAnsi="Arial"/>
+                <w:color w:val="000000" w:themeColor="text1"/>
+                <w:sz w:val="16"/>
+                <w:szCs w:val="16"/>
+              </w:rPr>
+            </w:pPr>
+            <w:r>
+              <w:rPr>
+                <w:rFonts w:ascii="Arial" w:hAnsi="Arial"/>
+                <w:color w:val="000000" w:themeColor="text1"/>
+                <w:sz w:val="16"/>
+                <w:szCs w:val="16"/>
+              </w:rPr>
+              <w:fldChar w:fldCharType="begin"/>
+            </w:r>
+            <w:r>
+              <w:rPr>
+                <w:rFonts w:ascii="Arial" w:hAnsi="Arial"/>
+                <w:color w:val="000000" w:themeColor="text1"/>
+                <w:sz w:val="16"/>
+                <w:szCs w:val="16"/>
+              </w:rPr>
+              <w:instrText xml:space="preserve"> MERGEFIELD  nro_documento  \* MERGEFORMAT </w:instrText>
+            </w:r>
+            <w:r>
+              <w:rPr>
+                <w:rFonts w:ascii="Arial" w:hAnsi="Arial"/>
+                <w:color w:val="000000" w:themeColor="text1"/>
+                <w:sz w:val="16"/>
+                <w:szCs w:val="16"/>
+              </w:rPr>
+              <w:fldChar w:fldCharType="separate"/>
+            </w:r>
+            <w:r>
+              <w:rPr>
+                <w:rFonts w:ascii="Arial" w:hAnsi="Arial"/>
+                <w:color w:val="000000" w:themeColor="text1"/>
+                <w:sz w:val="16"/>
+                <w:szCs w:val="16"/>
+              </w:rPr>
+              <w:t>«nro_documento»</w:t>
+            </w:r>
+            <w:r>
+              <w:rPr>
+                <w:rFonts w:ascii="Arial" w:hAnsi="Arial"/>
+                <w:color w:val="000000" w:themeColor="text1"/>
+                <w:sz w:val="16"/>
+                <w:szCs w:val="16"/>
+              </w:rPr>
+              <w:fldChar w:fldCharType="end"/>
+            </w:r>
+          </w:p>
+        </w:tc>
+        <w:tc>
+          <w:tcPr>
+            <w:tcW w:w="2896" w:type="dxa"/>
+          </w:tcPr>
+          <w:p>
+            <w:pPr>
+              <w:rPr>
+                <w:rFonts w:ascii="Arial" w:hAnsi="Arial"/>
+                <w:b/>
+                <w:bCs/>
+                <w:color w:val="000000" w:themeColor="text1"/>
+                <w:sz w:val="16"/>
+                <w:szCs w:val="16"/>
+              </w:rPr>
+            </w:pPr>
+            <w:r>
+              <w:rPr>
+                <w:rFonts w:ascii="Arial" w:hAnsi="Arial"/>
+                <w:b/>
+                <w:bCs/>
                 <w:color w:val="000000" w:themeColor="text1"/>
                 <w:sz w:val="16"/>
                 <w:szCs w:val="16"/>
                 <w:lang w:val="es-PE"/>
               </w:rPr>
+              <w:t>Empresa</w:t>
+            </w:r>
+          </w:p>
+        </w:tc>
+        <w:tc>
+          <w:tcPr>
+            <w:tcW w:w="2898" w:type="dxa"/>
+          </w:tcPr>
+          <w:p>
+            <w:pPr>
+              <w:rPr>
+                <w:rFonts w:ascii="Arial" w:hAnsi="Arial"/>
+                <w:color w:val="000000" w:themeColor="text1"/>
+                <w:sz w:val="16"/>
+                <w:szCs w:val="16"/>
+              </w:rPr>
+            </w:pPr>
+            <w:r>
+              <w:rPr>
+                <w:rFonts w:ascii="Arial" w:hAnsi="Arial"/>
+                <w:color w:val="000000" w:themeColor="text1"/>
+                <w:sz w:val="16"/>
+                <w:szCs w:val="16"/>
+              </w:rPr>
+              <w:fldChar w:fldCharType="begin"/>
+            </w:r>
+            <w:r>
+              <w:rPr>
+                <w:rFonts w:ascii="Arial" w:hAnsi="Arial"/>
+                <w:color w:val="000000" w:themeColor="text1"/>
+                <w:sz w:val="16"/>
+                <w:szCs w:val="16"/>
+              </w:rPr>
+              <w:instrText xml:space="preserve"> MERGEFIELD  nom_transportista  \* MERGEFORMAT </w:instrText>
+            </w:r>
+            <w:r>
+              <w:rPr>
+                <w:rFonts w:ascii="Arial" w:hAnsi="Arial"/>
+                <w:color w:val="000000" w:themeColor="text1"/>
+                <w:sz w:val="16"/>
+                <w:szCs w:val="16"/>
+              </w:rPr>
+              <w:fldChar w:fldCharType="separate"/>
+            </w:r>
+            <w:r>
+              <w:rPr>
+                <w:rFonts w:ascii="Arial" w:hAnsi="Arial"/>
+                <w:color w:val="000000" w:themeColor="text1"/>
+                <w:sz w:val="16"/>
+                <w:szCs w:val="16"/>
+              </w:rPr>
+              <w:t>«nom_transportista»</w:t>
+            </w:r>
+            <w:r>
+              <w:rPr>
+                <w:rFonts w:ascii="Arial" w:hAnsi="Arial"/>
+                <w:color w:val="000000" w:themeColor="text1"/>
+                <w:sz w:val="16"/>
+                <w:szCs w:val="16"/>
+              </w:rPr>
+              <w:fldChar w:fldCharType="end"/>
+            </w:r>
+          </w:p>
+        </w:tc>
+      </w:tr>
+      <w:tr>
+        <w:trPr>
+          <w:trHeight w:val="134"/>
+        </w:trPr>
+        <w:tc>
+          <w:tcPr>
+            <w:tcW w:w="1849" w:type="dxa"/>
+          </w:tcPr>
+          <w:p>
+            <w:pPr>
+              <w:rPr>
+                <w:rFonts w:ascii="Arial" w:hAnsi="Arial"/>
+                <w:b/>
+                <w:bCs/>
+                <w:color w:val="000000" w:themeColor="text1"/>
+                <w:sz w:val="16"/>
+                <w:szCs w:val="16"/>
+              </w:rPr>
+            </w:pPr>
+            <w:proofErr w:type="spellStart"/>
+            <w:r>
+              <w:rPr>
+                <w:rFonts w:ascii="Arial" w:hAnsi="Arial"/>
+                <w:b/>
+                <w:bCs/>
+                <w:color w:val="000000" w:themeColor="text1"/>
+                <w:sz w:val="16"/>
+                <w:szCs w:val="16"/>
+                <w:lang w:val="es-PE"/>
+              </w:rPr>
+              <w:t>N°</w:t>
+            </w:r>
+            <w:proofErr w:type="spellEnd"/>
+            <w:r>
+              <w:rPr>
+                <w:rFonts w:ascii="Arial" w:hAnsi="Arial"/>
+                <w:b/>
+                <w:bCs/>
+                <w:color w:val="000000" w:themeColor="text1"/>
+                <w:sz w:val="16"/>
+                <w:szCs w:val="16"/>
+                <w:lang w:val="es-PE"/>
+              </w:rPr>
+              <w:t xml:space="preserve"> Doc / Guia R.</w:t>
+            </w:r>
+          </w:p>
+        </w:tc>
+        <w:tc>
+          <w:tcPr>
+            <w:tcW w:w="3945" w:type="dxa"/>
+          </w:tcPr>
+          <w:p>
+            <w:pPr>
+              <w:rPr>
+                <w:rFonts w:ascii="Arial" w:hAnsi="Arial"/>
+                <w:color w:val="000000" w:themeColor="text1"/>
+                <w:sz w:val="16"/>
+                <w:szCs w:val="16"/>
+              </w:rPr>
+            </w:pPr>
+            <w:r>
+              <w:rPr>
+                <w:rFonts w:ascii="Arial" w:hAnsi="Arial"/>
+                <w:color w:val="000000" w:themeColor="text1"/>
+                <w:sz w:val="16"/>
+                <w:szCs w:val="16"/>
+              </w:rPr>
+              <w:fldChar w:fldCharType="begin"/>
+            </w:r>
+            <w:r>
+              <w:rPr>
+                <w:rFonts w:ascii="Arial" w:hAnsi="Arial"/>
+                <w:color w:val="000000" w:themeColor="text1"/>
+                <w:sz w:val="16"/>
+                <w:szCs w:val="16"/>
+              </w:rPr>
+              <w:instrText xml:space="preserve"> MERGEFIELD  guia_re  \* MERGEFORMAT </w:instrText>
+            </w:r>
+            <w:r>
+              <w:rPr>
+                <w:rFonts w:ascii="Arial" w:hAnsi="Arial"/>
+                <w:color w:val="000000" w:themeColor="text1"/>
+                <w:sz w:val="16"/>
+                <w:szCs w:val="16"/>
+              </w:rPr>
+              <w:fldChar w:fldCharType="separate"/>
+            </w:r>
+            <w:r>
+              <w:rPr>
+                <w:rFonts w:ascii="Arial" w:hAnsi="Arial"/>
+                <w:color w:val="000000" w:themeColor="text1"/>
+                <w:sz w:val="16"/>
+                <w:szCs w:val="16"/>
+              </w:rPr>
+              <w:t>«guia_re»</w:t>
+            </w:r>
+            <w:r>
+              <w:rPr>
+                <w:rFonts w:ascii="Arial" w:hAnsi="Arial"/>
+                <w:color w:val="000000" w:themeColor="text1"/>
+                <w:sz w:val="16"/>
+                <w:szCs w:val="16"/>
+              </w:rPr>
+              <w:fldChar w:fldCharType="end"/>
+            </w:r>
+          </w:p>
+        </w:tc>
+        <w:tc>
+          <w:tcPr>
+            <w:tcW w:w="2896" w:type="dxa"/>
+          </w:tcPr>
+          <w:p>
+            <w:pPr>
+              <w:rPr>
+                <w:rFonts w:ascii="Arial" w:hAnsi="Arial"/>
+                <w:b/>
+                <w:bCs/>
+                <w:color w:val="000000" w:themeColor="text1"/>
+                <w:sz w:val="16"/>
+                <w:szCs w:val="16"/>
+              </w:rPr>
+            </w:pPr>
+            <w:r>
+              <w:rPr>
+                <w:rFonts w:ascii="Arial" w:hAnsi="Arial"/>
+                <w:b/>
+                <w:bCs/>
+                <w:color w:val="000000" w:themeColor="text1"/>
+                <w:sz w:val="16"/>
+                <w:szCs w:val="16"/>
+                <w:lang w:val="es-PE"/>
+              </w:rPr>
+              <w:t>Ruc</w:t>
+            </w:r>
+          </w:p>
+        </w:tc>
+        <w:tc>
+          <w:tcPr>
+            <w:tcW w:w="2898" w:type="dxa"/>
+          </w:tcPr>
+          <w:p>
+            <w:pPr>
+              <w:rPr>
+                <w:rFonts w:ascii="Arial" w:hAnsi="Arial"/>
+                <w:color w:val="000000" w:themeColor="text1"/>
+                <w:sz w:val="16"/>
+                <w:szCs w:val="16"/>
+              </w:rPr>
+            </w:pPr>
+            <w:r>
+              <w:rPr>
+                <w:rFonts w:ascii="Arial" w:hAnsi="Arial"/>
+                <w:color w:val="000000" w:themeColor="text1"/>
+                <w:sz w:val="16"/>
+                <w:szCs w:val="16"/>
+              </w:rPr>
+              <w:fldChar w:fldCharType="begin"/>
+            </w:r>
+            <w:r>
+              <w:rPr>
+                <w:rFonts w:ascii="Arial" w:hAnsi="Arial"/>
+                <w:color w:val="000000" w:themeColor="text1"/>
+                <w:sz w:val="16"/>
+                <w:szCs w:val="16"/>
+              </w:rPr>
+              <w:instrText xml:space="preserve"> MERGEFIELD  ruc_trans  \* MERGEFORMAT </w:instrText>
+            </w:r>
+            <w:r>
+              <w:rPr>
+                <w:rFonts w:ascii="Arial" w:hAnsi="Arial"/>
+                <w:color w:val="000000" w:themeColor="text1"/>
+                <w:sz w:val="16"/>
+                <w:szCs w:val="16"/>
+              </w:rPr>
+              <w:fldChar w:fldCharType="separate"/>
+            </w:r>
+            <w:r>
+              <w:rPr>
+                <w:rFonts w:ascii="Arial" w:hAnsi="Arial"/>
+                <w:color w:val="000000" w:themeColor="text1"/>
+                <w:sz w:val="16"/>
+                <w:szCs w:val="16"/>
+              </w:rPr>
+              <w:t>«ruc_trans»</w:t>
+            </w:r>
+            <w:r>
+              <w:rPr>
+                <w:rFonts w:ascii="Arial" w:hAnsi="Arial"/>
+                <w:color w:val="000000" w:themeColor="text1"/>
+                <w:sz w:val="16"/>
+                <w:szCs w:val="16"/>
+              </w:rPr>
+              <w:fldChar w:fldCharType="end"/>
+            </w:r>
+          </w:p>
+        </w:tc>
+      </w:tr>
+      <w:tr>
+        <w:trPr>
+          <w:trHeight w:val="179"/>
+        </w:trPr>
+        <w:tc>
+          <w:tcPr>
+            <w:tcW w:w="1849" w:type="dxa"/>
+          </w:tcPr>
+          <w:p>
+            <w:pPr>
+              <w:rPr>
+                <w:rFonts w:ascii="Arial" w:hAnsi="Arial"/>
+                <w:color w:val="000000" w:themeColor="text1"/>
+                <w:sz w:val="16"/>
+                <w:szCs w:val="16"/>
+                <w:lang w:val="es-PE"/>
+              </w:rPr>
+            </w:pPr>
+          </w:p>
+        </w:tc>
+        <w:tc>
+          <w:tcPr>
+            <w:tcW w:w="3945" w:type="dxa"/>
+          </w:tcPr>
+          <w:p>
+            <w:pPr>
+              <w:rPr>
+                <w:rFonts w:ascii="Arial" w:hAnsi="Arial"/>
+                <w:color w:val="000000" w:themeColor="text1"/>
+                <w:sz w:val="16"/>
+                <w:szCs w:val="16"/>
+              </w:rPr>
+            </w:pPr>
+          </w:p>
+        </w:tc>
+        <w:tc>
+          <w:tcPr>
+            <w:tcW w:w="2896" w:type="dxa"/>
+          </w:tcPr>
+          <w:p>
+            <w:pPr>
+              <w:rPr>
+                <w:rFonts w:ascii="Arial" w:hAnsi="Arial"/>
+                <w:b/>
+                <w:bCs/>
+                <w:color w:val="000000" w:themeColor="text1"/>
+                <w:sz w:val="16"/>
+                <w:szCs w:val="16"/>
+                <w:lang w:val="es-PE"/>
+              </w:rPr>
+            </w:pPr>
+            <w:r>
+              <w:rPr>
+                <w:rFonts w:ascii="Arial" w:hAnsi="Arial"/>
+                <w:b/>
+                <w:bCs/>
+                <w:color w:val="000000" w:themeColor="text1"/>
+                <w:sz w:val="16"/>
+                <w:szCs w:val="16"/>
+                <w:lang w:val="es-PE"/>
+              </w:rPr>
               <w:t>Placa</w:t>
             </w:r>
           </w:p>
         </w:tc>
         <w:tc>
           <w:tcPr>
-            <w:tcW w:w="2904" w:type="dxa"/>
-          </w:tcPr>
-          <w:p>
-            <w:pPr>
-              <w:rPr>
-                <w:rFonts w:ascii="Arial" w:hAnsi="Arial"/>
-                <w:bCs/>
-                <w:color w:val="000000" w:themeColor="text1"/>
-                <w:sz w:val="16"/>
-                <w:szCs w:val="16"/>
-              </w:rPr>
-            </w:pPr>
-            <w:r>
-              <w:rPr>
-                <w:rFonts w:ascii="Arial" w:hAnsi="Arial"/>
-                <w:bCs/>
+            <w:tcW w:w="2898" w:type="dxa"/>
+          </w:tcPr>
+          <w:p>
+            <w:pPr>
+              <w:rPr>
+                <w:rFonts w:ascii="Arial" w:hAnsi="Arial"/>
+                <w:color w:val="000000" w:themeColor="text1"/>
+                <w:sz w:val="16"/>
+                <w:szCs w:val="16"/>
+              </w:rPr>
+            </w:pPr>
+            <w:r>
+              <w:rPr>
+                <w:rFonts w:ascii="Arial" w:hAnsi="Arial"/>
                 <w:color w:val="000000" w:themeColor="text1"/>
                 <w:sz w:val="16"/>
                 <w:szCs w:val="16"/>
@@ -2163,7 +2220,6 @@
             <w:r>
               <w:rPr>
                 <w:rFonts w:ascii="Arial" w:hAnsi="Arial"/>
-                <w:bCs/>
                 <w:color w:val="000000" w:themeColor="text1"/>
                 <w:sz w:val="16"/>
                 <w:szCs w:val="16"/>
@@ -2173,7 +2229,6 @@
             <w:r>
               <w:rPr>
                 <w:rFonts w:ascii="Arial" w:hAnsi="Arial"/>
-                <w:bCs/>
                 <w:color w:val="000000" w:themeColor="text1"/>
                 <w:sz w:val="16"/>
                 <w:szCs w:val="16"/>
@@ -2183,8 +2238,6 @@
             <w:r>
               <w:rPr>
                 <w:rFonts w:ascii="Arial" w:hAnsi="Arial"/>
-                <w:bCs/>
-                <w:noProof/>
                 <w:color w:val="000000" w:themeColor="text1"/>
                 <w:sz w:val="16"/>
                 <w:szCs w:val="16"/>
@@ -2194,7 +2247,6 @@
             <w:r>
               <w:rPr>
                 <w:rFonts w:ascii="Arial" w:hAnsi="Arial"/>
-                <w:bCs/>
                 <w:color w:val="000000" w:themeColor="text1"/>
                 <w:sz w:val="16"/>
                 <w:szCs w:val="16"/>
@@ -2204,7 +2256,6 @@
             <w:r>
               <w:rPr>
                 <w:rFonts w:ascii="Arial" w:hAnsi="Arial"/>
-                <w:bCs/>
                 <w:color w:val="000000" w:themeColor="text1"/>
                 <w:sz w:val="16"/>
                 <w:szCs w:val="16"/>
@@ -2242,6 +2293,9 @@
         <w:tc>
           <w:tcPr>
             <w:tcW w:w="641" w:type="pct"/>
+            <w:tcBorders>
+              <w:bottom w:val="single" w:sz="6" w:space="0" w:color="auto"/>
+            </w:tcBorders>
             <w:vAlign w:val="center"/>
           </w:tcPr>
           <w:p>
@@ -2250,25 +2304,201 @@
                 <w:rFonts w:ascii="Arial" w:hAnsi="Arial"/>
                 <w:b/>
                 <w:bCs/>
-                <w:sz w:val="16"/>
-                <w:szCs w:val="16"/>
-              </w:rPr>
-            </w:pPr>
-            <w:r>
-              <w:rPr>
-                <w:rFonts w:ascii="Arial" w:hAnsi="Arial"/>
-                <w:b/>
-                <w:bCs/>
+                <w:color w:val="000000" w:themeColor="text1"/>
+                <w:sz w:val="16"/>
+                <w:szCs w:val="16"/>
+              </w:rPr>
+            </w:pPr>
+            <w:proofErr w:type="spellStart"/>
+            <w:r>
+              <w:rPr>
+                <w:rFonts w:ascii="Arial" w:hAnsi="Arial"/>
+                <w:b/>
+                <w:bCs/>
+                <w:color w:val="000000" w:themeColor="text1"/>
+                <w:sz w:val="16"/>
+                <w:szCs w:val="16"/>
+              </w:rPr>
+              <w:t>Detalle</w:t>
+            </w:r>
+            <w:proofErr w:type="spellEnd"/>
+          </w:p>
+        </w:tc>
+        <w:tc>
+          <w:tcPr>
+            <w:tcW w:w="714" w:type="pct"/>
+            <w:tcBorders>
+              <w:bottom w:val="single" w:sz="6" w:space="0" w:color="auto"/>
+            </w:tcBorders>
+            <w:vAlign w:val="center"/>
+          </w:tcPr>
+          <w:p>
+            <w:pPr>
+              <w:rPr>
+                <w:rFonts w:ascii="Arial" w:hAnsi="Arial"/>
+                <w:b/>
+                <w:bCs/>
+                <w:color w:val="000000" w:themeColor="text1"/>
+                <w:sz w:val="16"/>
+                <w:szCs w:val="16"/>
+              </w:rPr>
+            </w:pPr>
+          </w:p>
+        </w:tc>
+        <w:tc>
+          <w:tcPr>
+            <w:tcW w:w="690" w:type="pct"/>
+            <w:tcBorders>
+              <w:bottom w:val="single" w:sz="6" w:space="0" w:color="auto"/>
+            </w:tcBorders>
+            <w:vAlign w:val="center"/>
+          </w:tcPr>
+          <w:p>
+            <w:pPr>
+              <w:rPr>
+                <w:rFonts w:ascii="Arial" w:hAnsi="Arial"/>
+                <w:b/>
+                <w:bCs/>
+                <w:color w:val="000000" w:themeColor="text1"/>
+                <w:sz w:val="16"/>
+                <w:szCs w:val="16"/>
+              </w:rPr>
+            </w:pPr>
+          </w:p>
+        </w:tc>
+        <w:tc>
+          <w:tcPr>
+            <w:tcW w:w="850" w:type="pct"/>
+            <w:tcBorders>
+              <w:bottom w:val="single" w:sz="6" w:space="0" w:color="auto"/>
+            </w:tcBorders>
+            <w:vAlign w:val="center"/>
+          </w:tcPr>
+          <w:p>
+            <w:pPr>
+              <w:rPr>
+                <w:rFonts w:ascii="Arial" w:hAnsi="Arial"/>
+                <w:b/>
+                <w:bCs/>
+                <w:color w:val="000000" w:themeColor="text1"/>
+                <w:sz w:val="16"/>
+                <w:szCs w:val="16"/>
+              </w:rPr>
+            </w:pPr>
+          </w:p>
+        </w:tc>
+        <w:tc>
+          <w:tcPr>
+            <w:tcW w:w="553" w:type="pct"/>
+            <w:tcBorders>
+              <w:bottom w:val="single" w:sz="6" w:space="0" w:color="auto"/>
+            </w:tcBorders>
+            <w:vAlign w:val="center"/>
+          </w:tcPr>
+          <w:p>
+            <w:pPr>
+              <w:ind w:left="140"/>
+              <w:rPr>
+                <w:rFonts w:ascii="Arial" w:hAnsi="Arial"/>
+                <w:b/>
+                <w:bCs/>
+                <w:color w:val="000000" w:themeColor="text1"/>
+                <w:sz w:val="16"/>
+                <w:szCs w:val="16"/>
+              </w:rPr>
+            </w:pPr>
+          </w:p>
+        </w:tc>
+        <w:tc>
+          <w:tcPr>
+            <w:tcW w:w="555" w:type="pct"/>
+            <w:tcBorders>
+              <w:bottom w:val="single" w:sz="6" w:space="0" w:color="auto"/>
+            </w:tcBorders>
+            <w:vAlign w:val="center"/>
+          </w:tcPr>
+          <w:p>
+            <w:pPr>
+              <w:rPr>
+                <w:rFonts w:ascii="Arial" w:hAnsi="Arial"/>
+                <w:b/>
+                <w:bCs/>
+                <w:color w:val="000000" w:themeColor="text1"/>
+                <w:sz w:val="16"/>
+                <w:szCs w:val="16"/>
+              </w:rPr>
+            </w:pPr>
+          </w:p>
+        </w:tc>
+        <w:tc>
+          <w:tcPr>
+            <w:tcW w:w="997" w:type="pct"/>
+            <w:tcBorders>
+              <w:bottom w:val="single" w:sz="6" w:space="0" w:color="auto"/>
+            </w:tcBorders>
+            <w:vAlign w:val="center"/>
+          </w:tcPr>
+          <w:p>
+            <w:pPr>
+              <w:ind w:left="142"/>
+              <w:rPr>
+                <w:rFonts w:ascii="Arial" w:hAnsi="Arial"/>
+                <w:b/>
+                <w:bCs/>
+                <w:color w:val="000000" w:themeColor="text1"/>
+                <w:sz w:val="16"/>
+                <w:szCs w:val="16"/>
+              </w:rPr>
+            </w:pPr>
+          </w:p>
+        </w:tc>
+      </w:tr>
+      <w:tr>
+        <w:trPr>
+          <w:trHeight w:val="330"/>
+        </w:trPr>
+        <w:tc>
+          <w:tcPr>
+            <w:tcW w:w="641" w:type="pct"/>
+            <w:tcBorders>
+              <w:top w:val="single" w:sz="6" w:space="0" w:color="auto"/>
+              <w:bottom w:val="single" w:sz="6" w:space="0" w:color="auto"/>
+            </w:tcBorders>
+            <w:vAlign w:val="center"/>
+          </w:tcPr>
+          <w:p>
+            <w:pPr>
+              <w:rPr>
+                <w:rFonts w:ascii="Arial" w:hAnsi="Arial"/>
+                <w:b/>
+                <w:bCs/>
+                <w:color w:val="000000" w:themeColor="text1"/>
+                <w:sz w:val="16"/>
+                <w:szCs w:val="16"/>
+              </w:rPr>
+            </w:pPr>
+            <w:proofErr w:type="spellStart"/>
+            <w:r>
+              <w:rPr>
+                <w:rFonts w:ascii="Arial" w:hAnsi="Arial"/>
+                <w:b/>
+                <w:bCs/>
+                <w:color w:val="000000" w:themeColor="text1"/>
                 <w:sz w:val="16"/>
                 <w:szCs w:val="16"/>
               </w:rPr>
               <w:t>Producto</w:t>
             </w:r>
+            <w:proofErr w:type="spellEnd"/>
           </w:p>
         </w:tc>
         <w:tc>
           <w:tcPr>
             <w:tcW w:w="714" w:type="pct"/>
+            <w:tcBorders>
+              <w:top w:val="single" w:sz="6" w:space="0" w:color="auto"/>
+              <w:bottom w:val="single" w:sz="6" w:space="0" w:color="auto"/>
+            </w:tcBorders>
             <w:vAlign w:val="center"/>
           </w:tcPr>
           <w:p>
@@ -2277,35 +2507,31 @@
                 <w:rFonts w:ascii="Arial" w:hAnsi="Arial"/>
                 <w:b/>
                 <w:bCs/>
-                <w:sz w:val="16"/>
-                <w:szCs w:val="16"/>
-              </w:rPr>
-            </w:pPr>
-            <w:r>
-              <w:rPr>
-                <w:rFonts w:ascii="Arial" w:hAnsi="Arial"/>
-                <w:b/>
-                <w:bCs/>
-                <w:sz w:val="16"/>
-                <w:szCs w:val="16"/>
-              </w:rPr>
-              <w:t>Có</w:t>
-            </w:r>
-            <w:r>
-              <w:rPr>
-                <w:rFonts w:ascii="Arial" w:hAnsi="Arial"/>
-                <w:b/>
-                <w:bCs/>
-                <w:sz w:val="16"/>
-                <w:szCs w:val="16"/>
-              </w:rPr>
-              <w:t>digo Único</w:t>
+                <w:color w:val="000000" w:themeColor="text1"/>
+                <w:sz w:val="16"/>
+                <w:szCs w:val="16"/>
+              </w:rPr>
+            </w:pPr>
+            <w:r>
+              <w:rPr>
+                <w:rFonts w:ascii="Arial" w:hAnsi="Arial"/>
+                <w:b/>
+                <w:bCs/>
+                <w:color w:val="000000" w:themeColor="text1"/>
+                <w:sz w:val="16"/>
+                <w:szCs w:val="16"/>
+              </w:rPr>
+              <w:t>Código Único</w:t>
             </w:r>
           </w:p>
         </w:tc>
         <w:tc>
           <w:tcPr>
             <w:tcW w:w="690" w:type="pct"/>
+            <w:tcBorders>
+              <w:top w:val="single" w:sz="6" w:space="0" w:color="auto"/>
+              <w:bottom w:val="single" w:sz="6" w:space="0" w:color="auto"/>
+            </w:tcBorders>
             <w:vAlign w:val="center"/>
           </w:tcPr>
           <w:p>
@@ -2314,15 +2540,17 @@
                 <w:rFonts w:ascii="Arial" w:hAnsi="Arial"/>
                 <w:b/>
                 <w:bCs/>
-                <w:sz w:val="16"/>
-                <w:szCs w:val="16"/>
-              </w:rPr>
-            </w:pPr>
-            <w:r>
-              <w:rPr>
-                <w:rFonts w:ascii="Arial" w:hAnsi="Arial"/>
-                <w:b/>
-                <w:bCs/>
+                <w:color w:val="000000" w:themeColor="text1"/>
+                <w:sz w:val="16"/>
+                <w:szCs w:val="16"/>
+              </w:rPr>
+            </w:pPr>
+            <w:r>
+              <w:rPr>
+                <w:rFonts w:ascii="Arial" w:hAnsi="Arial"/>
+                <w:b/>
+                <w:bCs/>
+                <w:color w:val="000000" w:themeColor="text1"/>
                 <w:sz w:val="16"/>
                 <w:szCs w:val="16"/>
               </w:rPr>
@@ -2333,6 +2561,10 @@
         <w:tc>
           <w:tcPr>
             <w:tcW w:w="850" w:type="pct"/>
+            <w:tcBorders>
+              <w:top w:val="single" w:sz="6" w:space="0" w:color="auto"/>
+              <w:bottom w:val="single" w:sz="6" w:space="0" w:color="auto"/>
+            </w:tcBorders>
             <w:vAlign w:val="center"/>
           </w:tcPr>
           <w:p>
@@ -2341,15 +2573,17 @@
                 <w:rFonts w:ascii="Arial" w:hAnsi="Arial"/>
                 <w:b/>
                 <w:bCs/>
-                <w:sz w:val="16"/>
-                <w:szCs w:val="16"/>
-              </w:rPr>
-            </w:pPr>
-            <w:r>
-              <w:rPr>
-                <w:rFonts w:ascii="Arial" w:hAnsi="Arial"/>
-                <w:b/>
-                <w:bCs/>
+                <w:color w:val="000000" w:themeColor="text1"/>
+                <w:sz w:val="16"/>
+                <w:szCs w:val="16"/>
+              </w:rPr>
+            </w:pPr>
+            <w:r>
+              <w:rPr>
+                <w:rFonts w:ascii="Arial" w:hAnsi="Arial"/>
+                <w:b/>
+                <w:bCs/>
+                <w:color w:val="000000" w:themeColor="text1"/>
                 <w:sz w:val="16"/>
                 <w:szCs w:val="16"/>
               </w:rPr>
@@ -2360,6 +2594,10 @@
         <w:tc>
           <w:tcPr>
             <w:tcW w:w="553" w:type="pct"/>
+            <w:tcBorders>
+              <w:top w:val="single" w:sz="6" w:space="0" w:color="auto"/>
+              <w:bottom w:val="single" w:sz="6" w:space="0" w:color="auto"/>
+            </w:tcBorders>
             <w:vAlign w:val="center"/>
           </w:tcPr>
           <w:p>
@@ -2369,25 +2607,33 @@
                 <w:rFonts w:ascii="Arial" w:hAnsi="Arial"/>
                 <w:b/>
                 <w:bCs/>
-                <w:sz w:val="16"/>
-                <w:szCs w:val="16"/>
-              </w:rPr>
-            </w:pPr>
-            <w:r>
-              <w:rPr>
-                <w:rFonts w:ascii="Arial" w:hAnsi="Arial"/>
-                <w:b/>
-                <w:bCs/>
+                <w:color w:val="000000" w:themeColor="text1"/>
+                <w:sz w:val="16"/>
+                <w:szCs w:val="16"/>
+              </w:rPr>
+            </w:pPr>
+            <w:proofErr w:type="spellStart"/>
+            <w:r>
+              <w:rPr>
+                <w:rFonts w:ascii="Arial" w:hAnsi="Arial"/>
+                <w:b/>
+                <w:bCs/>
+                <w:color w:val="000000" w:themeColor="text1"/>
                 <w:sz w:val="16"/>
                 <w:szCs w:val="16"/>
               </w:rPr>
               <w:t>Envase</w:t>
             </w:r>
+            <w:proofErr w:type="spellEnd"/>
           </w:p>
         </w:tc>
         <w:tc>
           <w:tcPr>
             <w:tcW w:w="555" w:type="pct"/>
+            <w:tcBorders>
+              <w:top w:val="single" w:sz="6" w:space="0" w:color="auto"/>
+              <w:bottom w:val="single" w:sz="6" w:space="0" w:color="auto"/>
+            </w:tcBorders>
             <w:vAlign w:val="center"/>
           </w:tcPr>
           <w:p>
@@ -2396,25 +2642,33 @@
                 <w:rFonts w:ascii="Arial" w:hAnsi="Arial"/>
                 <w:b/>
                 <w:bCs/>
-                <w:sz w:val="16"/>
-                <w:szCs w:val="16"/>
-              </w:rPr>
-            </w:pPr>
-            <w:r>
-              <w:rPr>
-                <w:rFonts w:ascii="Arial" w:hAnsi="Arial"/>
-                <w:b/>
-                <w:bCs/>
+                <w:color w:val="000000" w:themeColor="text1"/>
+                <w:sz w:val="16"/>
+                <w:szCs w:val="16"/>
+              </w:rPr>
+            </w:pPr>
+            <w:proofErr w:type="spellStart"/>
+            <w:r>
+              <w:rPr>
+                <w:rFonts w:ascii="Arial" w:hAnsi="Arial"/>
+                <w:b/>
+                <w:bCs/>
+                <w:color w:val="000000" w:themeColor="text1"/>
                 <w:sz w:val="16"/>
                 <w:szCs w:val="16"/>
               </w:rPr>
               <w:t>Cantidad</w:t>
             </w:r>
-          </w:p>
-        </w:tc>
-        <w:tc>
-          <w:tcPr>
-            <w:tcW w:w="998" w:type="pct"/>
+            <w:proofErr w:type="spellEnd"/>
+          </w:p>
+        </w:tc>
+        <w:tc>
+          <w:tcPr>
+            <w:tcW w:w="997" w:type="pct"/>
+            <w:tcBorders>
+              <w:top w:val="single" w:sz="6" w:space="0" w:color="auto"/>
+              <w:bottom w:val="single" w:sz="6" w:space="0" w:color="auto"/>
+            </w:tcBorders>
             <w:vAlign w:val="center"/>
           </w:tcPr>
           <w:p>
@@ -2424,15 +2678,17 @@
                 <w:rFonts w:ascii="Arial" w:hAnsi="Arial"/>
                 <w:b/>
                 <w:bCs/>
-                <w:sz w:val="16"/>
-                <w:szCs w:val="16"/>
-              </w:rPr>
-            </w:pPr>
-            <w:r>
-              <w:rPr>
-                <w:rFonts w:ascii="Arial" w:hAnsi="Arial"/>
-                <w:b/>
-                <w:bCs/>
+                <w:color w:val="000000" w:themeColor="text1"/>
+                <w:sz w:val="16"/>
+                <w:szCs w:val="16"/>
+              </w:rPr>
+            </w:pPr>
+            <w:r>
+              <w:rPr>
+                <w:rFonts w:ascii="Arial" w:hAnsi="Arial"/>
+                <w:b/>
+                <w:bCs/>
+                <w:color w:val="000000" w:themeColor="text1"/>
                 <w:sz w:val="16"/>
                 <w:szCs w:val="16"/>
               </w:rPr>
@@ -2448,19 +2704,24 @@
         <w:tc>
           <w:tcPr>
             <w:tcW w:w="641" w:type="pct"/>
+            <w:tcBorders>
+              <w:top w:val="single" w:sz="6" w:space="0" w:color="auto"/>
+            </w:tcBorders>
             <w:vAlign w:val="center"/>
           </w:tcPr>
           <w:p>
             <w:pPr>
               <w:rPr>
                 <w:rFonts w:ascii="Arial" w:hAnsi="Arial"/>
-                <w:sz w:val="16"/>
-                <w:szCs w:val="16"/>
-              </w:rPr>
-            </w:pPr>
-            <w:r>
-              <w:rPr>
-                <w:rFonts w:ascii="Arial" w:hAnsi="Arial"/>
+                <w:color w:val="000000" w:themeColor="text1"/>
+                <w:sz w:val="16"/>
+                <w:szCs w:val="16"/>
+              </w:rPr>
+            </w:pPr>
+            <w:r>
+              <w:rPr>
+                <w:rFonts w:ascii="Arial" w:hAnsi="Arial"/>
+                <w:color w:val="000000" w:themeColor="text1"/>
                 <w:sz w:val="16"/>
                 <w:szCs w:val="16"/>
               </w:rPr>
@@ -2469,6 +2730,7 @@
             <w:r>
               <w:rPr>
                 <w:rFonts w:ascii="Arial" w:hAnsi="Arial"/>
+                <w:color w:val="000000" w:themeColor="text1"/>
                 <w:sz w:val="16"/>
                 <w:szCs w:val="16"/>
               </w:rPr>
@@ -2477,6 +2739,7 @@
             <w:r>
               <w:rPr>
                 <w:rFonts w:ascii="Arial" w:hAnsi="Arial"/>
+                <w:color w:val="000000" w:themeColor="text1"/>
                 <w:sz w:val="16"/>
                 <w:szCs w:val="16"/>
               </w:rPr>
@@ -2485,6 +2748,7 @@
             <w:r>
               <w:rPr>
                 <w:rFonts w:ascii="Arial" w:hAnsi="Arial"/>
+                <w:color w:val="000000" w:themeColor="text1"/>
                 <w:sz w:val="16"/>
                 <w:szCs w:val="16"/>
               </w:rPr>
@@ -2493,6 +2757,7 @@
             <w:r>
               <w:rPr>
                 <w:rFonts w:ascii="Arial" w:hAnsi="Arial"/>
+                <w:color w:val="000000" w:themeColor="text1"/>
                 <w:sz w:val="16"/>
                 <w:szCs w:val="16"/>
               </w:rPr>
@@ -2503,19 +2768,24 @@
         <w:tc>
           <w:tcPr>
             <w:tcW w:w="714" w:type="pct"/>
+            <w:tcBorders>
+              <w:top w:val="single" w:sz="6" w:space="0" w:color="auto"/>
+            </w:tcBorders>
             <w:vAlign w:val="center"/>
           </w:tcPr>
           <w:p>
             <w:pPr>
               <w:rPr>
                 <w:rFonts w:ascii="Arial" w:hAnsi="Arial"/>
-                <w:sz w:val="16"/>
-                <w:szCs w:val="16"/>
-              </w:rPr>
-            </w:pPr>
-            <w:r>
-              <w:rPr>
-                <w:rFonts w:ascii="Arial" w:hAnsi="Arial"/>
+                <w:color w:val="000000" w:themeColor="text1"/>
+                <w:sz w:val="16"/>
+                <w:szCs w:val="16"/>
+              </w:rPr>
+            </w:pPr>
+            <w:r>
+              <w:rPr>
+                <w:rFonts w:ascii="Arial" w:hAnsi="Arial"/>
+                <w:color w:val="000000" w:themeColor="text1"/>
                 <w:sz w:val="16"/>
                 <w:szCs w:val="16"/>
               </w:rPr>
@@ -2524,6 +2794,7 @@
             <w:r>
               <w:rPr>
                 <w:rFonts w:ascii="Arial" w:hAnsi="Arial"/>
+                <w:color w:val="000000" w:themeColor="text1"/>
                 <w:sz w:val="16"/>
                 <w:szCs w:val="16"/>
               </w:rPr>
@@ -2532,6 +2803,7 @@
             <w:r>
               <w:rPr>
                 <w:rFonts w:ascii="Arial" w:hAnsi="Arial"/>
+                <w:color w:val="000000" w:themeColor="text1"/>
                 <w:sz w:val="16"/>
                 <w:szCs w:val="16"/>
               </w:rPr>
@@ -2541,6 +2813,7 @@
               <w:rPr>
                 <w:rFonts w:ascii="Arial" w:hAnsi="Arial"/>
                 <w:noProof/>
+                <w:color w:val="000000" w:themeColor="text1"/>
                 <w:sz w:val="16"/>
                 <w:szCs w:val="16"/>
               </w:rPr>
@@ -2549,6 +2822,7 @@
             <w:r>
               <w:rPr>
                 <w:rFonts w:ascii="Arial" w:hAnsi="Arial"/>
+                <w:color w:val="000000" w:themeColor="text1"/>
                 <w:sz w:val="16"/>
                 <w:szCs w:val="16"/>
               </w:rPr>
@@ -2559,19 +2833,24 @@
         <w:tc>
           <w:tcPr>
             <w:tcW w:w="690" w:type="pct"/>
+            <w:tcBorders>
+              <w:top w:val="single" w:sz="6" w:space="0" w:color="auto"/>
+            </w:tcBorders>
             <w:vAlign w:val="center"/>
           </w:tcPr>
           <w:p>
             <w:pPr>
               <w:rPr>
                 <w:rFonts w:ascii="Arial" w:hAnsi="Arial"/>
-                <w:sz w:val="16"/>
-                <w:szCs w:val="16"/>
-              </w:rPr>
-            </w:pPr>
-            <w:r>
-              <w:rPr>
-                <w:rFonts w:ascii="Arial" w:hAnsi="Arial"/>
+                <w:color w:val="000000" w:themeColor="text1"/>
+                <w:sz w:val="16"/>
+                <w:szCs w:val="16"/>
+              </w:rPr>
+            </w:pPr>
+            <w:r>
+              <w:rPr>
+                <w:rFonts w:ascii="Arial" w:hAnsi="Arial"/>
+                <w:color w:val="000000" w:themeColor="text1"/>
                 <w:sz w:val="16"/>
                 <w:szCs w:val="16"/>
               </w:rPr>
@@ -2580,6 +2859,7 @@
             <w:r>
               <w:rPr>
                 <w:rFonts w:ascii="Arial" w:hAnsi="Arial"/>
+                <w:color w:val="000000" w:themeColor="text1"/>
                 <w:sz w:val="16"/>
                 <w:szCs w:val="16"/>
               </w:rPr>
@@ -2588,6 +2868,7 @@
             <w:r>
               <w:rPr>
                 <w:rFonts w:ascii="Arial" w:hAnsi="Arial"/>
+                <w:color w:val="000000" w:themeColor="text1"/>
                 <w:sz w:val="16"/>
                 <w:szCs w:val="16"/>
               </w:rPr>
@@ -2597,6 +2878,7 @@
               <w:rPr>
                 <w:rFonts w:ascii="Arial" w:hAnsi="Arial"/>
                 <w:noProof/>
+                <w:color w:val="000000" w:themeColor="text1"/>
                 <w:sz w:val="16"/>
                 <w:szCs w:val="16"/>
               </w:rPr>
@@ -2605,6 +2887,7 @@
             <w:r>
               <w:rPr>
                 <w:rFonts w:ascii="Arial" w:hAnsi="Arial"/>
+                <w:color w:val="000000" w:themeColor="text1"/>
                 <w:sz w:val="16"/>
                 <w:szCs w:val="16"/>
               </w:rPr>
@@ -2615,19 +2898,24 @@
         <w:tc>
           <w:tcPr>
             <w:tcW w:w="850" w:type="pct"/>
+            <w:tcBorders>
+              <w:top w:val="single" w:sz="6" w:space="0" w:color="auto"/>
+            </w:tcBorders>
             <w:vAlign w:val="center"/>
           </w:tcPr>
           <w:p>
             <w:pPr>
               <w:rPr>
                 <w:rFonts w:ascii="Arial" w:hAnsi="Arial"/>
-                <w:sz w:val="16"/>
-                <w:szCs w:val="16"/>
-              </w:rPr>
-            </w:pPr>
-            <w:r>
-              <w:rPr>
-                <w:rFonts w:ascii="Arial" w:hAnsi="Arial"/>
+                <w:color w:val="000000" w:themeColor="text1"/>
+                <w:sz w:val="16"/>
+                <w:szCs w:val="16"/>
+              </w:rPr>
+            </w:pPr>
+            <w:r>
+              <w:rPr>
+                <w:rFonts w:ascii="Arial" w:hAnsi="Arial"/>
+                <w:color w:val="000000" w:themeColor="text1"/>
                 <w:sz w:val="16"/>
                 <w:szCs w:val="16"/>
               </w:rPr>
@@ -2636,6 +2924,7 @@
             <w:r>
               <w:rPr>
                 <w:rFonts w:ascii="Arial" w:hAnsi="Arial"/>
+                <w:color w:val="000000" w:themeColor="text1"/>
                 <w:sz w:val="16"/>
                 <w:szCs w:val="16"/>
               </w:rPr>
@@ -2644,6 +2933,7 @@
             <w:r>
               <w:rPr>
                 <w:rFonts w:ascii="Arial" w:hAnsi="Arial"/>
+                <w:color w:val="000000" w:themeColor="text1"/>
                 <w:sz w:val="16"/>
                 <w:szCs w:val="16"/>
               </w:rPr>
@@ -2653,6 +2943,7 @@
               <w:rPr>
                 <w:rFonts w:ascii="Arial" w:hAnsi="Arial"/>
                 <w:noProof/>
+                <w:color w:val="000000" w:themeColor="text1"/>
                 <w:sz w:val="16"/>
                 <w:szCs w:val="16"/>
               </w:rPr>
@@ -2661,6 +2952,7 @@
             <w:r>
               <w:rPr>
                 <w:rFonts w:ascii="Arial" w:hAnsi="Arial"/>
+                <w:color w:val="000000" w:themeColor="text1"/>
                 <w:sz w:val="16"/>
                 <w:szCs w:val="16"/>
               </w:rPr>
@@ -2671,6 +2963,9 @@
         <w:tc>
           <w:tcPr>
             <w:tcW w:w="553" w:type="pct"/>
+            <w:tcBorders>
+              <w:top w:val="single" w:sz="6" w:space="0" w:color="auto"/>
+            </w:tcBorders>
             <w:vAlign w:val="center"/>
           </w:tcPr>
           <w:p>
@@ -2678,13 +2973,15 @@
               <w:ind w:left="140"/>
               <w:rPr>
                 <w:rFonts w:ascii="Arial" w:hAnsi="Arial"/>
-                <w:sz w:val="16"/>
-                <w:szCs w:val="16"/>
-              </w:rPr>
-            </w:pPr>
-            <w:r>
-              <w:rPr>
-                <w:rFonts w:ascii="Arial" w:hAnsi="Arial"/>
+                <w:color w:val="000000" w:themeColor="text1"/>
+                <w:sz w:val="16"/>
+                <w:szCs w:val="16"/>
+              </w:rPr>
+            </w:pPr>
+            <w:r>
+              <w:rPr>
+                <w:rFonts w:ascii="Arial" w:hAnsi="Arial"/>
+                <w:color w:val="000000" w:themeColor="text1"/>
                 <w:sz w:val="16"/>
                 <w:szCs w:val="16"/>
               </w:rPr>
@@ -2693,6 +2990,7 @@
             <w:r>
               <w:rPr>
                 <w:rFonts w:ascii="Arial" w:hAnsi="Arial"/>
+                <w:color w:val="000000" w:themeColor="text1"/>
                 <w:sz w:val="16"/>
                 <w:szCs w:val="16"/>
               </w:rPr>
@@ -2701,6 +2999,7 @@
             <w:r>
               <w:rPr>
                 <w:rFonts w:ascii="Arial" w:hAnsi="Arial"/>
+                <w:color w:val="000000" w:themeColor="text1"/>
                 <w:sz w:val="16"/>
                 <w:szCs w:val="16"/>
               </w:rPr>
@@ -2709,6 +3008,7 @@
             <w:r>
               <w:rPr>
                 <w:rFonts w:ascii="Arial" w:hAnsi="Arial"/>
+                <w:color w:val="000000" w:themeColor="text1"/>
                 <w:sz w:val="16"/>
                 <w:szCs w:val="16"/>
               </w:rPr>
@@ -2717,6 +3017,7 @@
             <w:r>
               <w:rPr>
                 <w:rFonts w:ascii="Arial" w:hAnsi="Arial"/>
+                <w:color w:val="000000" w:themeColor="text1"/>
                 <w:sz w:val="16"/>
                 <w:szCs w:val="16"/>
               </w:rPr>
@@ -2727,19 +3028,24 @@
         <w:tc>
           <w:tcPr>
             <w:tcW w:w="555" w:type="pct"/>
+            <w:tcBorders>
+              <w:top w:val="single" w:sz="6" w:space="0" w:color="auto"/>
+            </w:tcBorders>
             <w:vAlign w:val="center"/>
           </w:tcPr>
           <w:p>
             <w:pPr>
               <w:rPr>
                 <w:rFonts w:ascii="Arial" w:hAnsi="Arial"/>
-                <w:sz w:val="16"/>
-                <w:szCs w:val="16"/>
-              </w:rPr>
-            </w:pPr>
-            <w:r>
-              <w:rPr>
-                <w:rFonts w:ascii="Arial" w:hAnsi="Arial"/>
+                <w:color w:val="000000" w:themeColor="text1"/>
+                <w:sz w:val="16"/>
+                <w:szCs w:val="16"/>
+              </w:rPr>
+            </w:pPr>
+            <w:r>
+              <w:rPr>
+                <w:rFonts w:ascii="Arial" w:hAnsi="Arial"/>
+                <w:color w:val="000000" w:themeColor="text1"/>
                 <w:sz w:val="16"/>
                 <w:szCs w:val="16"/>
               </w:rPr>
@@ -2748,6 +3054,7 @@
             <w:r>
               <w:rPr>
                 <w:rFonts w:ascii="Arial" w:hAnsi="Arial"/>
+                <w:color w:val="000000" w:themeColor="text1"/>
                 <w:sz w:val="16"/>
                 <w:szCs w:val="16"/>
               </w:rPr>
@@ -2756,6 +3063,7 @@
             <w:r>
               <w:rPr>
                 <w:rFonts w:ascii="Arial" w:hAnsi="Arial"/>
+                <w:color w:val="000000" w:themeColor="text1"/>
                 <w:sz w:val="16"/>
                 <w:szCs w:val="16"/>
               </w:rPr>
@@ -2764,6 +3072,7 @@
             <w:r>
               <w:rPr>
                 <w:rFonts w:ascii="Arial" w:hAnsi="Arial"/>
+                <w:color w:val="000000" w:themeColor="text1"/>
                 <w:sz w:val="16"/>
                 <w:szCs w:val="16"/>
               </w:rPr>
@@ -2772,6 +3081,7 @@
             <w:r>
               <w:rPr>
                 <w:rFonts w:ascii="Arial" w:hAnsi="Arial"/>
+                <w:color w:val="000000" w:themeColor="text1"/>
                 <w:sz w:val="16"/>
                 <w:szCs w:val="16"/>
               </w:rPr>
@@ -2781,7 +3091,10 @@
         </w:tc>
         <w:tc>
           <w:tcPr>
-            <w:tcW w:w="998" w:type="pct"/>
+            <w:tcW w:w="997" w:type="pct"/>
+            <w:tcBorders>
+              <w:top w:val="single" w:sz="6" w:space="0" w:color="auto"/>
+            </w:tcBorders>
             <w:vAlign w:val="center"/>
           </w:tcPr>
           <w:p>
@@ -2789,13 +3102,15 @@
               <w:ind w:left="142"/>
               <w:rPr>
                 <w:rFonts w:ascii="Arial" w:hAnsi="Arial"/>
-                <w:sz w:val="16"/>
-                <w:szCs w:val="16"/>
-              </w:rPr>
-            </w:pPr>
-            <w:r>
-              <w:rPr>
-                <w:rFonts w:ascii="Arial" w:hAnsi="Arial"/>
+                <w:color w:val="000000" w:themeColor="text1"/>
+                <w:sz w:val="16"/>
+                <w:szCs w:val="16"/>
+              </w:rPr>
+            </w:pPr>
+            <w:r>
+              <w:rPr>
+                <w:rFonts w:ascii="Arial" w:hAnsi="Arial"/>
+                <w:color w:val="000000" w:themeColor="text1"/>
                 <w:sz w:val="16"/>
                 <w:szCs w:val="16"/>
               </w:rPr>
@@ -2804,6 +3119,7 @@
             <w:r>
               <w:rPr>
                 <w:rFonts w:ascii="Arial" w:hAnsi="Arial"/>
+                <w:color w:val="000000" w:themeColor="text1"/>
                 <w:sz w:val="16"/>
                 <w:szCs w:val="16"/>
               </w:rPr>
@@ -2812,6 +3128,7 @@
             <w:r>
               <w:rPr>
                 <w:rFonts w:ascii="Arial" w:hAnsi="Arial"/>
+                <w:color w:val="000000" w:themeColor="text1"/>
                 <w:sz w:val="16"/>
                 <w:szCs w:val="16"/>
               </w:rPr>
@@ -2820,6 +3137,7 @@
             <w:r>
               <w:rPr>
                 <w:rFonts w:ascii="Arial" w:hAnsi="Arial"/>
+                <w:color w:val="000000" w:themeColor="text1"/>
                 <w:sz w:val="16"/>
                 <w:szCs w:val="16"/>
               </w:rPr>
@@ -2828,6 +3146,7 @@
             <w:r>
               <w:rPr>
                 <w:rFonts w:ascii="Arial" w:hAnsi="Arial"/>
+                <w:color w:val="000000" w:themeColor="text1"/>
                 <w:sz w:val="16"/>
                 <w:szCs w:val="16"/>
               </w:rPr>
@@ -2897,6 +3216,7 @@
               <w:rPr>
                 <w:rFonts w:ascii="Arial" w:hAnsi="Arial"/>
                 <w:b/>
+                <w:bCs/>
                 <w:color w:val="000000" w:themeColor="text1"/>
                 <w:sz w:val="16"/>
                 <w:szCs w:val="16"/>
@@ -2907,6 +3227,7 @@
               <w:rPr>
                 <w:rFonts w:ascii="Arial" w:hAnsi="Arial"/>
                 <w:b/>
+                <w:bCs/>
                 <w:color w:val="000000" w:themeColor="text1"/>
                 <w:sz w:val="16"/>
                 <w:szCs w:val="16"/>
@@ -2924,7 +3245,6 @@
             <w:pPr>
               <w:rPr>
                 <w:rFonts w:ascii="Arial" w:hAnsi="Arial"/>
-                <w:bCs/>
                 <w:color w:val="000000" w:themeColor="text1"/>
                 <w:sz w:val="16"/>
                 <w:szCs w:val="16"/>
@@ -2940,7 +3260,6 @@
             <w:pPr>
               <w:rPr>
                 <w:rFonts w:ascii="Arial" w:hAnsi="Arial"/>
-                <w:b/>
                 <w:color w:val="000000" w:themeColor="text1"/>
                 <w:sz w:val="16"/>
                 <w:szCs w:val="16"/>
@@ -2958,6 +3277,7 @@
               <w:rPr>
                 <w:rFonts w:ascii="Arial" w:hAnsi="Arial"/>
                 <w:b/>
+                <w:bCs/>
                 <w:color w:val="000000" w:themeColor="text1"/>
                 <w:sz w:val="16"/>
                 <w:szCs w:val="16"/>
@@ -2968,6 +3288,7 @@
               <w:rPr>
                 <w:rFonts w:ascii="Arial" w:hAnsi="Arial"/>
                 <w:b/>
+                <w:bCs/>
                 <w:color w:val="000000" w:themeColor="text1"/>
                 <w:sz w:val="16"/>
                 <w:szCs w:val="16"/>
@@ -2985,17 +3306,14 @@
             <w:pPr>
               <w:rPr>
                 <w:rFonts w:ascii="Arial" w:hAnsi="Arial"/>
-                <w:bCs/>
-                <w:color w:val="000000" w:themeColor="text1"/>
-                <w:sz w:val="16"/>
-                <w:szCs w:val="16"/>
-              </w:rPr>
-            </w:pPr>
-            <w:r>
-              <w:rPr>
-                <w:rFonts w:ascii="Arial" w:hAnsi="Arial"/>
-                <w:bCs/>
-                <w:noProof/>
+                <w:color w:val="000000" w:themeColor="text1"/>
+                <w:sz w:val="16"/>
+                <w:szCs w:val="16"/>
+              </w:rPr>
+            </w:pPr>
+            <w:r>
+              <w:rPr>
+                <w:rFonts w:ascii="Arial" w:hAnsi="Arial"/>
                 <w:color w:val="000000" w:themeColor="text1"/>
                 <w:sz w:val="16"/>
                 <w:szCs w:val="16"/>
@@ -3005,8 +3323,6 @@
             <w:r>
               <w:rPr>
                 <w:rFonts w:ascii="Arial" w:hAnsi="Arial"/>
-                <w:bCs/>
-                <w:noProof/>
                 <w:color w:val="000000" w:themeColor="text1"/>
                 <w:sz w:val="16"/>
                 <w:szCs w:val="16"/>
@@ -3016,8 +3332,6 @@
             <w:r>
               <w:rPr>
                 <w:rFonts w:ascii="Arial" w:hAnsi="Arial"/>
-                <w:bCs/>
-                <w:noProof/>
                 <w:color w:val="000000" w:themeColor="text1"/>
                 <w:sz w:val="16"/>
                 <w:szCs w:val="16"/>
@@ -3027,8 +3341,6 @@
             <w:r>
               <w:rPr>
                 <w:rFonts w:ascii="Arial" w:hAnsi="Arial"/>
-                <w:bCs/>
-                <w:noProof/>
                 <w:color w:val="000000" w:themeColor="text1"/>
                 <w:sz w:val="16"/>
                 <w:szCs w:val="16"/>
@@ -3038,8 +3350,6 @@
             <w:r>
               <w:rPr>
                 <w:rFonts w:ascii="Arial" w:hAnsi="Arial"/>
-                <w:bCs/>
-                <w:noProof/>
                 <w:color w:val="000000" w:themeColor="text1"/>
                 <w:sz w:val="16"/>
                 <w:szCs w:val="16"/>
@@ -3051,7 +3361,7 @@
       </w:tr>
       <w:tr>
         <w:trPr>
-          <w:trHeight w:val="438"/>
+          <w:trHeight w:val="119"/>
         </w:trPr>
         <w:tc>
           <w:tcPr>
@@ -3061,16 +3371,18 @@
             <w:pPr>
               <w:rPr>
                 <w:rFonts w:ascii="Arial" w:hAnsi="Arial"/>
-                <w:bCs/>
-                <w:color w:val="000000" w:themeColor="text1"/>
-                <w:sz w:val="16"/>
-                <w:szCs w:val="16"/>
-              </w:rPr>
-            </w:pPr>
-            <w:r>
-              <w:rPr>
-                <w:rFonts w:ascii="Arial" w:hAnsi="Arial"/>
-                <w:b/>
+                <w:b/>
+                <w:bCs/>
+                <w:color w:val="000000" w:themeColor="text1"/>
+                <w:sz w:val="16"/>
+                <w:szCs w:val="16"/>
+              </w:rPr>
+            </w:pPr>
+            <w:r>
+              <w:rPr>
+                <w:rFonts w:ascii="Arial" w:hAnsi="Arial"/>
+                <w:b/>
+                <w:bCs/>
                 <w:color w:val="000000" w:themeColor="text1"/>
                 <w:sz w:val="16"/>
                 <w:szCs w:val="16"/>
@@ -3088,16 +3400,14 @@
             <w:pPr>
               <w:rPr>
                 <w:rFonts w:ascii="Arial" w:hAnsi="Arial"/>
-                <w:bCs/>
-                <w:color w:val="000000" w:themeColor="text1"/>
-                <w:sz w:val="16"/>
-                <w:szCs w:val="16"/>
-              </w:rPr>
-            </w:pPr>
-            <w:r>
-              <w:rPr>
-                <w:rFonts w:ascii="Arial" w:hAnsi="Arial"/>
-                <w:bCs/>
+                <w:color w:val="000000" w:themeColor="text1"/>
+                <w:sz w:val="16"/>
+                <w:szCs w:val="16"/>
+              </w:rPr>
+            </w:pPr>
+            <w:r>
+              <w:rPr>
+                <w:rFonts w:ascii="Arial" w:hAnsi="Arial"/>
                 <w:color w:val="000000" w:themeColor="text1"/>
                 <w:sz w:val="16"/>
                 <w:szCs w:val="16"/>
@@ -3107,7 +3417,6 @@
             <w:r>
               <w:rPr>
                 <w:rFonts w:ascii="Arial" w:hAnsi="Arial"/>
-                <w:bCs/>
                 <w:color w:val="000000" w:themeColor="text1"/>
                 <w:sz w:val="16"/>
                 <w:szCs w:val="16"/>
@@ -3117,7 +3426,6 @@
             <w:r>
               <w:rPr>
                 <w:rFonts w:ascii="Arial" w:hAnsi="Arial"/>
-                <w:bCs/>
                 <w:color w:val="000000" w:themeColor="text1"/>
                 <w:sz w:val="16"/>
                 <w:szCs w:val="16"/>
@@ -3127,8 +3435,6 @@
             <w:r>
               <w:rPr>
                 <w:rFonts w:ascii="Arial" w:hAnsi="Arial"/>
-                <w:bCs/>
-                <w:noProof/>
                 <w:color w:val="000000" w:themeColor="text1"/>
                 <w:sz w:val="16"/>
                 <w:szCs w:val="16"/>
@@ -3138,7 +3444,6 @@
             <w:r>
               <w:rPr>
                 <w:rFonts w:ascii="Arial" w:hAnsi="Arial"/>
-                <w:bCs/>
                 <w:color w:val="000000" w:themeColor="text1"/>
                 <w:sz w:val="16"/>
                 <w:szCs w:val="16"/>
@@ -3148,7 +3453,6 @@
             <w:r>
               <w:rPr>
                 <w:rFonts w:ascii="Arial" w:hAnsi="Arial"/>
-                <w:bCs/>
                 <w:color w:val="000000" w:themeColor="text1"/>
                 <w:sz w:val="16"/>
                 <w:szCs w:val="16"/>
@@ -3165,7 +3469,6 @@
             <w:pPr>
               <w:rPr>
                 <w:rFonts w:ascii="Arial" w:hAnsi="Arial"/>
-                <w:b/>
                 <w:color w:val="000000" w:themeColor="text1"/>
                 <w:sz w:val="16"/>
                 <w:szCs w:val="16"/>
@@ -3175,7 +3478,6 @@
             <w:r>
               <w:rPr>
                 <w:rFonts w:ascii="Arial" w:hAnsi="Arial"/>
-                <w:bCs/>
                 <w:color w:val="000000" w:themeColor="text1"/>
                 <w:sz w:val="16"/>
                 <w:szCs w:val="16"/>
@@ -3185,7 +3487,6 @@
             <w:r>
               <w:rPr>
                 <w:rFonts w:ascii="Arial" w:hAnsi="Arial"/>
-                <w:bCs/>
                 <w:color w:val="000000" w:themeColor="text1"/>
                 <w:sz w:val="16"/>
                 <w:szCs w:val="16"/>
@@ -3195,7 +3496,6 @@
             <w:r>
               <w:rPr>
                 <w:rFonts w:ascii="Arial" w:hAnsi="Arial"/>
-                <w:bCs/>
                 <w:color w:val="000000" w:themeColor="text1"/>
                 <w:sz w:val="16"/>
                 <w:szCs w:val="16"/>
@@ -3205,7 +3505,6 @@
             <w:r>
               <w:rPr>
                 <w:rFonts w:ascii="Arial" w:hAnsi="Arial"/>
-                <w:bCs/>
                 <w:color w:val="000000" w:themeColor="text1"/>
                 <w:sz w:val="16"/>
                 <w:szCs w:val="16"/>
@@ -3215,8 +3514,6 @@
             <w:r>
               <w:rPr>
                 <w:rFonts w:ascii="Arial" w:hAnsi="Arial"/>
-                <w:bCs/>
-                <w:noProof/>
                 <w:color w:val="000000" w:themeColor="text1"/>
                 <w:sz w:val="16"/>
                 <w:szCs w:val="16"/>
@@ -3226,7 +3523,6 @@
             <w:r>
               <w:rPr>
                 <w:rFonts w:ascii="Arial" w:hAnsi="Arial"/>
-                <w:bCs/>
                 <w:color w:val="000000" w:themeColor="text1"/>
                 <w:sz w:val="16"/>
                 <w:szCs w:val="16"/>
@@ -3243,16 +3539,18 @@
             <w:pPr>
               <w:rPr>
                 <w:rFonts w:ascii="Arial" w:hAnsi="Arial"/>
-                <w:bCs/>
-                <w:color w:val="000000" w:themeColor="text1"/>
-                <w:sz w:val="16"/>
-                <w:szCs w:val="16"/>
-              </w:rPr>
-            </w:pPr>
-            <w:r>
-              <w:rPr>
-                <w:rFonts w:ascii="Arial" w:hAnsi="Arial"/>
-                <w:b/>
+                <w:b/>
+                <w:bCs/>
+                <w:color w:val="000000" w:themeColor="text1"/>
+                <w:sz w:val="16"/>
+                <w:szCs w:val="16"/>
+              </w:rPr>
+            </w:pPr>
+            <w:r>
+              <w:rPr>
+                <w:rFonts w:ascii="Arial" w:hAnsi="Arial"/>
+                <w:b/>
+                <w:bCs/>
                 <w:color w:val="000000" w:themeColor="text1"/>
                 <w:sz w:val="16"/>
                 <w:szCs w:val="16"/>
@@ -3270,16 +3568,14 @@
             <w:pPr>
               <w:rPr>
                 <w:rFonts w:ascii="Arial" w:hAnsi="Arial"/>
-                <w:bCs/>
-                <w:color w:val="000000" w:themeColor="text1"/>
-                <w:sz w:val="16"/>
-                <w:szCs w:val="16"/>
-              </w:rPr>
-            </w:pPr>
-            <w:r>
-              <w:rPr>
-                <w:rFonts w:ascii="Arial" w:hAnsi="Arial"/>
-                <w:bCs/>
+                <w:color w:val="000000" w:themeColor="text1"/>
+                <w:sz w:val="16"/>
+                <w:szCs w:val="16"/>
+              </w:rPr>
+            </w:pPr>
+            <w:r>
+              <w:rPr>
+                <w:rFonts w:ascii="Arial" w:hAnsi="Arial"/>
                 <w:color w:val="000000" w:themeColor="text1"/>
                 <w:sz w:val="16"/>
                 <w:szCs w:val="16"/>
@@ -3289,7 +3585,6 @@
             <w:r>
               <w:rPr>
                 <w:rFonts w:ascii="Arial" w:hAnsi="Arial"/>
-                <w:bCs/>
                 <w:color w:val="000000" w:themeColor="text1"/>
                 <w:sz w:val="16"/>
                 <w:szCs w:val="16"/>
@@ -3299,7 +3594,6 @@
             <w:r>
               <w:rPr>
                 <w:rFonts w:ascii="Arial" w:hAnsi="Arial"/>
-                <w:bCs/>
                 <w:color w:val="000000" w:themeColor="text1"/>
                 <w:sz w:val="16"/>
                 <w:szCs w:val="16"/>
@@ -3309,8 +3603,6 @@
             <w:r>
               <w:rPr>
                 <w:rFonts w:ascii="Arial" w:hAnsi="Arial"/>
-                <w:bCs/>
-                <w:noProof/>
                 <w:color w:val="000000" w:themeColor="text1"/>
                 <w:sz w:val="16"/>
                 <w:szCs w:val="16"/>
@@ -3320,7 +3612,6 @@
             <w:r>
               <w:rPr>
                 <w:rFonts w:ascii="Arial" w:hAnsi="Arial"/>
-                <w:bCs/>
                 <w:color w:val="000000" w:themeColor="text1"/>
                 <w:sz w:val="16"/>
                 <w:szCs w:val="16"/>
@@ -3332,7 +3623,7 @@
       </w:tr>
       <w:tr>
         <w:trPr>
-          <w:trHeight w:val="274"/>
+          <w:trHeight w:val="166"/>
         </w:trPr>
         <w:tc>
           <w:tcPr>
@@ -3342,16 +3633,18 @@
             <w:pPr>
               <w:rPr>
                 <w:rFonts w:ascii="Arial" w:hAnsi="Arial"/>
-                <w:bCs/>
-                <w:color w:val="000000" w:themeColor="text1"/>
-                <w:sz w:val="16"/>
-                <w:szCs w:val="16"/>
-              </w:rPr>
-            </w:pPr>
-            <w:r>
-              <w:rPr>
-                <w:rFonts w:ascii="Arial" w:hAnsi="Arial"/>
-                <w:b/>
+                <w:b/>
+                <w:bCs/>
+                <w:color w:val="000000" w:themeColor="text1"/>
+                <w:sz w:val="16"/>
+                <w:szCs w:val="16"/>
+              </w:rPr>
+            </w:pPr>
+            <w:r>
+              <w:rPr>
+                <w:rFonts w:ascii="Arial" w:hAnsi="Arial"/>
+                <w:b/>
+                <w:bCs/>
                 <w:color w:val="000000" w:themeColor="text1"/>
                 <w:sz w:val="16"/>
                 <w:szCs w:val="16"/>
@@ -3369,16 +3662,14 @@
             <w:pPr>
               <w:rPr>
                 <w:rFonts w:ascii="Arial" w:hAnsi="Arial"/>
-                <w:bCs/>
-                <w:color w:val="000000" w:themeColor="text1"/>
-                <w:sz w:val="16"/>
-                <w:szCs w:val="16"/>
-              </w:rPr>
-            </w:pPr>
-            <w:r>
-              <w:rPr>
-                <w:rFonts w:ascii="Arial" w:hAnsi="Arial"/>
-                <w:bCs/>
+                <w:color w:val="000000" w:themeColor="text1"/>
+                <w:sz w:val="16"/>
+                <w:szCs w:val="16"/>
+              </w:rPr>
+            </w:pPr>
+            <w:r>
+              <w:rPr>
+                <w:rFonts w:ascii="Arial" w:hAnsi="Arial"/>
                 <w:color w:val="000000" w:themeColor="text1"/>
                 <w:sz w:val="16"/>
                 <w:szCs w:val="16"/>
@@ -3388,7 +3679,6 @@
             <w:r>
               <w:rPr>
                 <w:rFonts w:ascii="Arial" w:hAnsi="Arial"/>
-                <w:bCs/>
                 <w:color w:val="000000" w:themeColor="text1"/>
                 <w:sz w:val="16"/>
                 <w:szCs w:val="16"/>
@@ -3398,7 +3688,6 @@
             <w:r>
               <w:rPr>
                 <w:rFonts w:ascii="Arial" w:hAnsi="Arial"/>
-                <w:bCs/>
                 <w:color w:val="000000" w:themeColor="text1"/>
                 <w:sz w:val="16"/>
                 <w:szCs w:val="16"/>
@@ -3408,8 +3697,6 @@
             <w:r>
               <w:rPr>
                 <w:rFonts w:ascii="Arial" w:hAnsi="Arial"/>
-                <w:bCs/>
-                <w:noProof/>
                 <w:color w:val="000000" w:themeColor="text1"/>
                 <w:sz w:val="16"/>
                 <w:szCs w:val="16"/>
@@ -3419,7 +3706,6 @@
             <w:r>
               <w:rPr>
                 <w:rFonts w:ascii="Arial" w:hAnsi="Arial"/>
-                <w:bCs/>
                 <w:color w:val="000000" w:themeColor="text1"/>
                 <w:sz w:val="16"/>
                 <w:szCs w:val="16"/>
@@ -3429,7 +3715,6 @@
             <w:r>
               <w:rPr>
                 <w:rFonts w:ascii="Arial" w:hAnsi="Arial"/>
-                <w:bCs/>
                 <w:color w:val="000000" w:themeColor="text1"/>
                 <w:sz w:val="16"/>
                 <w:szCs w:val="16"/>
@@ -3446,16 +3731,14 @@
             <w:pPr>
               <w:rPr>
                 <w:rFonts w:ascii="Arial" w:hAnsi="Arial"/>
-                <w:bCs/>
-                <w:color w:val="000000" w:themeColor="text1"/>
-                <w:sz w:val="16"/>
-                <w:szCs w:val="16"/>
-              </w:rPr>
-            </w:pPr>
-            <w:r>
-              <w:rPr>
-                <w:rFonts w:ascii="Arial" w:hAnsi="Arial"/>
-                <w:bCs/>
+                <w:color w:val="000000" w:themeColor="text1"/>
+                <w:sz w:val="16"/>
+                <w:szCs w:val="16"/>
+              </w:rPr>
+            </w:pPr>
+            <w:r>
+              <w:rPr>
+                <w:rFonts w:ascii="Arial" w:hAnsi="Arial"/>
                 <w:color w:val="000000" w:themeColor="text1"/>
                 <w:sz w:val="16"/>
                 <w:szCs w:val="16"/>
@@ -3465,7 +3748,6 @@
             <w:r>
               <w:rPr>
                 <w:rFonts w:ascii="Arial" w:hAnsi="Arial"/>
-                <w:bCs/>
                 <w:color w:val="000000" w:themeColor="text1"/>
                 <w:sz w:val="16"/>
                 <w:szCs w:val="16"/>
@@ -3475,7 +3757,6 @@
             <w:r>
               <w:rPr>
                 <w:rFonts w:ascii="Arial" w:hAnsi="Arial"/>
-                <w:bCs/>
                 <w:color w:val="000000" w:themeColor="text1"/>
                 <w:sz w:val="16"/>
                 <w:szCs w:val="16"/>
@@ -3485,7 +3766,6 @@
             <w:r>
               <w:rPr>
                 <w:rFonts w:ascii="Arial" w:hAnsi="Arial"/>
-                <w:bCs/>
                 <w:color w:val="000000" w:themeColor="text1"/>
                 <w:sz w:val="16"/>
                 <w:szCs w:val="16"/>
@@ -3495,8 +3775,6 @@
             <w:r>
               <w:rPr>
                 <w:rFonts w:ascii="Arial" w:hAnsi="Arial"/>
-                <w:bCs/>
-                <w:noProof/>
                 <w:color w:val="000000" w:themeColor="text1"/>
                 <w:sz w:val="16"/>
                 <w:szCs w:val="16"/>
@@ -3506,7 +3784,6 @@
             <w:r>
               <w:rPr>
                 <w:rFonts w:ascii="Arial" w:hAnsi="Arial"/>
-                <w:bCs/>
                 <w:color w:val="000000" w:themeColor="text1"/>
                 <w:sz w:val="16"/>
                 <w:szCs w:val="16"/>
@@ -3524,15 +3801,17 @@
               <w:rPr>
                 <w:rFonts w:ascii="Arial" w:hAnsi="Arial"/>
                 <w:b/>
-                <w:color w:val="000000" w:themeColor="text1"/>
-                <w:sz w:val="16"/>
-                <w:szCs w:val="16"/>
-              </w:rPr>
-            </w:pPr>
-            <w:r>
-              <w:rPr>
-                <w:rFonts w:ascii="Arial" w:hAnsi="Arial"/>
-                <w:b/>
+                <w:bCs/>
+                <w:color w:val="000000" w:themeColor="text1"/>
+                <w:sz w:val="16"/>
+                <w:szCs w:val="16"/>
+              </w:rPr>
+            </w:pPr>
+            <w:r>
+              <w:rPr>
+                <w:rFonts w:ascii="Arial" w:hAnsi="Arial"/>
+                <w:b/>
+                <w:bCs/>
                 <w:color w:val="000000" w:themeColor="text1"/>
                 <w:sz w:val="16"/>
                 <w:szCs w:val="16"/>
@@ -3549,16 +3828,14 @@
             <w:pPr>
               <w:rPr>
                 <w:rFonts w:ascii="Arial" w:hAnsi="Arial"/>
-                <w:bCs/>
-                <w:color w:val="000000" w:themeColor="text1"/>
-                <w:sz w:val="16"/>
-                <w:szCs w:val="16"/>
-              </w:rPr>
-            </w:pPr>
-            <w:r>
-              <w:rPr>
-                <w:rFonts w:ascii="Arial" w:hAnsi="Arial"/>
-                <w:bCs/>
+                <w:color w:val="000000" w:themeColor="text1"/>
+                <w:sz w:val="16"/>
+                <w:szCs w:val="16"/>
+              </w:rPr>
+            </w:pPr>
+            <w:r>
+              <w:rPr>
+                <w:rFonts w:ascii="Arial" w:hAnsi="Arial"/>
                 <w:color w:val="000000" w:themeColor="text1"/>
                 <w:sz w:val="16"/>
                 <w:szCs w:val="16"/>
@@ -3568,7 +3845,6 @@
             <w:r>
               <w:rPr>
                 <w:rFonts w:ascii="Arial" w:hAnsi="Arial"/>
-                <w:bCs/>
                 <w:color w:val="000000" w:themeColor="text1"/>
                 <w:sz w:val="16"/>
                 <w:szCs w:val="16"/>
@@ -3578,7 +3854,6 @@
             <w:r>
               <w:rPr>
                 <w:rFonts w:ascii="Arial" w:hAnsi="Arial"/>
-                <w:bCs/>
                 <w:color w:val="000000" w:themeColor="text1"/>
                 <w:sz w:val="16"/>
                 <w:szCs w:val="16"/>
@@ -3588,8 +3863,6 @@
             <w:r>
               <w:rPr>
                 <w:rFonts w:ascii="Arial" w:hAnsi="Arial"/>
-                <w:bCs/>
-                <w:noProof/>
                 <w:color w:val="000000" w:themeColor="text1"/>
                 <w:sz w:val="16"/>
                 <w:szCs w:val="16"/>
@@ -3599,7 +3872,6 @@
             <w:r>
               <w:rPr>
                 <w:rFonts w:ascii="Arial" w:hAnsi="Arial"/>
-                <w:bCs/>
                 <w:color w:val="000000" w:themeColor="text1"/>
                 <w:sz w:val="16"/>
                 <w:szCs w:val="16"/>
@@ -3611,7 +3883,7 @@
       </w:tr>
       <w:tr>
         <w:trPr>
-          <w:trHeight w:val="294"/>
+          <w:trHeight w:val="113"/>
         </w:trPr>
         <w:tc>
           <w:tcPr>
@@ -3621,16 +3893,18 @@
             <w:pPr>
               <w:rPr>
                 <w:rFonts w:ascii="Arial" w:hAnsi="Arial"/>
-                <w:bCs/>
-                <w:color w:val="000000" w:themeColor="text1"/>
-                <w:sz w:val="16"/>
-                <w:szCs w:val="16"/>
-              </w:rPr>
-            </w:pPr>
-            <w:r>
-              <w:rPr>
-                <w:rFonts w:ascii="Arial" w:hAnsi="Arial"/>
-                <w:b/>
+                <w:b/>
+                <w:bCs/>
+                <w:color w:val="000000" w:themeColor="text1"/>
+                <w:sz w:val="16"/>
+                <w:szCs w:val="16"/>
+              </w:rPr>
+            </w:pPr>
+            <w:r>
+              <w:rPr>
+                <w:rFonts w:ascii="Arial" w:hAnsi="Arial"/>
+                <w:b/>
+                <w:bCs/>
                 <w:color w:val="000000" w:themeColor="text1"/>
                 <w:sz w:val="16"/>
                 <w:szCs w:val="16"/>
@@ -3648,16 +3922,14 @@
             <w:pPr>
               <w:rPr>
                 <w:rFonts w:ascii="Arial" w:hAnsi="Arial"/>
-                <w:bCs/>
-                <w:color w:val="000000" w:themeColor="text1"/>
-                <w:sz w:val="16"/>
-                <w:szCs w:val="16"/>
-              </w:rPr>
-            </w:pPr>
-            <w:r>
-              <w:rPr>
-                <w:rFonts w:ascii="Arial" w:hAnsi="Arial"/>
-                <w:bCs/>
+                <w:color w:val="000000" w:themeColor="text1"/>
+                <w:sz w:val="16"/>
+                <w:szCs w:val="16"/>
+              </w:rPr>
+            </w:pPr>
+            <w:r>
+              <w:rPr>
+                <w:rFonts w:ascii="Arial" w:hAnsi="Arial"/>
                 <w:color w:val="000000" w:themeColor="text1"/>
                 <w:sz w:val="16"/>
                 <w:szCs w:val="16"/>
@@ -3667,7 +3939,6 @@
             <w:r>
               <w:rPr>
                 <w:rFonts w:ascii="Arial" w:hAnsi="Arial"/>
-                <w:bCs/>
                 <w:color w:val="000000" w:themeColor="text1"/>
                 <w:sz w:val="16"/>
                 <w:szCs w:val="16"/>
@@ -3677,7 +3948,6 @@
             <w:r>
               <w:rPr>
                 <w:rFonts w:ascii="Arial" w:hAnsi="Arial"/>
-                <w:bCs/>
                 <w:color w:val="000000" w:themeColor="text1"/>
                 <w:sz w:val="16"/>
                 <w:szCs w:val="16"/>
@@ -3687,7 +3957,6 @@
             <w:r>
               <w:rPr>
                 <w:rFonts w:ascii="Arial" w:hAnsi="Arial"/>
-                <w:bCs/>
                 <w:noProof/>
                 <w:color w:val="000000" w:themeColor="text1"/>
                 <w:sz w:val="16"/>
@@ -3698,7 +3967,6 @@
             <w:r>
               <w:rPr>
                 <w:rFonts w:ascii="Arial" w:hAnsi="Arial"/>
-                <w:bCs/>
                 <w:color w:val="000000" w:themeColor="text1"/>
                 <w:sz w:val="16"/>
                 <w:szCs w:val="16"/>
@@ -3708,7 +3976,6 @@
             <w:r>
               <w:rPr>
                 <w:rFonts w:ascii="Arial" w:hAnsi="Arial"/>
-                <w:bCs/>
                 <w:color w:val="000000" w:themeColor="text1"/>
                 <w:sz w:val="16"/>
                 <w:szCs w:val="16"/>
@@ -3725,7 +3992,6 @@
             <w:pPr>
               <w:rPr>
                 <w:rFonts w:ascii="Arial" w:hAnsi="Arial"/>
-                <w:b/>
                 <w:color w:val="000000" w:themeColor="text1"/>
                 <w:sz w:val="16"/>
                 <w:szCs w:val="16"/>
@@ -3743,15 +4009,17 @@
               <w:rPr>
                 <w:rFonts w:ascii="Arial" w:hAnsi="Arial"/>
                 <w:b/>
-                <w:color w:val="000000" w:themeColor="text1"/>
-                <w:sz w:val="16"/>
-                <w:szCs w:val="16"/>
-              </w:rPr>
-            </w:pPr>
-            <w:r>
-              <w:rPr>
-                <w:rFonts w:ascii="Arial" w:hAnsi="Arial"/>
-                <w:b/>
+                <w:bCs/>
+                <w:color w:val="000000" w:themeColor="text1"/>
+                <w:sz w:val="16"/>
+                <w:szCs w:val="16"/>
+              </w:rPr>
+            </w:pPr>
+            <w:r>
+              <w:rPr>
+                <w:rFonts w:ascii="Arial" w:hAnsi="Arial"/>
+                <w:b/>
+                <w:bCs/>
                 <w:color w:val="000000" w:themeColor="text1"/>
                 <w:sz w:val="16"/>
                 <w:szCs w:val="16"/>
@@ -3768,16 +4036,14 @@
             <w:pPr>
               <w:rPr>
                 <w:rFonts w:ascii="Arial" w:hAnsi="Arial"/>
-                <w:bCs/>
-                <w:color w:val="000000" w:themeColor="text1"/>
-                <w:sz w:val="16"/>
-                <w:szCs w:val="16"/>
-              </w:rPr>
-            </w:pPr>
-            <w:r>
-              <w:rPr>
-                <w:rFonts w:ascii="Arial" w:hAnsi="Arial"/>
-                <w:bCs/>
+                <w:color w:val="000000" w:themeColor="text1"/>
+                <w:sz w:val="16"/>
+                <w:szCs w:val="16"/>
+              </w:rPr>
+            </w:pPr>
+            <w:r>
+              <w:rPr>
+                <w:rFonts w:ascii="Arial" w:hAnsi="Arial"/>
                 <w:color w:val="000000" w:themeColor="text1"/>
                 <w:sz w:val="16"/>
                 <w:szCs w:val="16"/>
@@ -3787,7 +4053,6 @@
             <w:r>
               <w:rPr>
                 <w:rFonts w:ascii="Arial" w:hAnsi="Arial"/>
-                <w:bCs/>
                 <w:color w:val="000000" w:themeColor="text1"/>
                 <w:sz w:val="16"/>
                 <w:szCs w:val="16"/>
@@ -3797,7 +4062,6 @@
             <w:r>
               <w:rPr>
                 <w:rFonts w:ascii="Arial" w:hAnsi="Arial"/>
-                <w:bCs/>
                 <w:color w:val="000000" w:themeColor="text1"/>
                 <w:sz w:val="16"/>
                 <w:szCs w:val="16"/>
@@ -3807,8 +4071,6 @@
             <w:r>
               <w:rPr>
                 <w:rFonts w:ascii="Arial" w:hAnsi="Arial"/>
-                <w:bCs/>
-                <w:noProof/>
                 <w:color w:val="000000" w:themeColor="text1"/>
                 <w:sz w:val="16"/>
                 <w:szCs w:val="16"/>
@@ -3818,7 +4080,6 @@
             <w:r>
               <w:rPr>
                 <w:rFonts w:ascii="Arial" w:hAnsi="Arial"/>
-                <w:bCs/>
                 <w:color w:val="000000" w:themeColor="text1"/>
                 <w:sz w:val="16"/>
                 <w:szCs w:val="16"/>
@@ -3830,7 +4091,7 @@
       </w:tr>
       <w:tr>
         <w:trPr>
-          <w:trHeight w:val="294"/>
+          <w:trHeight w:val="48"/>
         </w:trPr>
         <w:tc>
           <w:tcPr>
@@ -3840,7 +4101,6 @@
             <w:pPr>
               <w:rPr>
                 <w:rFonts w:ascii="Arial" w:hAnsi="Arial"/>
-                <w:b/>
                 <w:color w:val="000000" w:themeColor="text1"/>
                 <w:sz w:val="16"/>
                 <w:szCs w:val="16"/>
@@ -3857,7 +4117,6 @@
             <w:pPr>
               <w:rPr>
                 <w:rFonts w:ascii="Arial" w:hAnsi="Arial"/>
-                <w:bCs/>
                 <w:color w:val="000000" w:themeColor="text1"/>
                 <w:sz w:val="16"/>
                 <w:szCs w:val="16"/>
@@ -3873,7 +4132,6 @@
             <w:pPr>
               <w:rPr>
                 <w:rFonts w:ascii="Arial" w:hAnsi="Arial"/>
-                <w:b/>
                 <w:color w:val="000000" w:themeColor="text1"/>
                 <w:sz w:val="16"/>
                 <w:szCs w:val="16"/>
@@ -3891,6 +4149,7 @@
               <w:rPr>
                 <w:rFonts w:ascii="Arial" w:hAnsi="Arial"/>
                 <w:b/>
+                <w:bCs/>
                 <w:color w:val="000000" w:themeColor="text1"/>
                 <w:sz w:val="16"/>
                 <w:szCs w:val="16"/>
@@ -3901,6 +4160,7 @@
               <w:rPr>
                 <w:rFonts w:ascii="Arial" w:hAnsi="Arial"/>
                 <w:b/>
+                <w:bCs/>
                 <w:color w:val="000000" w:themeColor="text1"/>
                 <w:sz w:val="16"/>
                 <w:szCs w:val="16"/>
@@ -3918,16 +4178,14 @@
             <w:pPr>
               <w:rPr>
                 <w:rFonts w:ascii="Arial" w:hAnsi="Arial"/>
-                <w:bCs/>
-                <w:color w:val="000000" w:themeColor="text1"/>
-                <w:sz w:val="16"/>
-                <w:szCs w:val="16"/>
-              </w:rPr>
-            </w:pPr>
-            <w:r>
-              <w:rPr>
-                <w:rFonts w:ascii="Arial" w:hAnsi="Arial"/>
-                <w:bCs/>
+                <w:color w:val="000000" w:themeColor="text1"/>
+                <w:sz w:val="16"/>
+                <w:szCs w:val="16"/>
+              </w:rPr>
+            </w:pPr>
+            <w:r>
+              <w:rPr>
+                <w:rFonts w:ascii="Arial" w:hAnsi="Arial"/>
                 <w:color w:val="000000" w:themeColor="text1"/>
                 <w:sz w:val="16"/>
                 <w:szCs w:val="16"/>
@@ -3937,7 +4195,6 @@
             <w:r>
               <w:rPr>
                 <w:rFonts w:ascii="Arial" w:hAnsi="Arial"/>
-                <w:bCs/>
                 <w:color w:val="000000" w:themeColor="text1"/>
                 <w:sz w:val="16"/>
                 <w:szCs w:val="16"/>
@@ -3947,7 +4204,6 @@
             <w:r>
               <w:rPr>
                 <w:rFonts w:ascii="Arial" w:hAnsi="Arial"/>
-                <w:bCs/>
                 <w:color w:val="000000" w:themeColor="text1"/>
                 <w:sz w:val="16"/>
                 <w:szCs w:val="16"/>
@@ -3957,8 +4213,6 @@
             <w:r>
               <w:rPr>
                 <w:rFonts w:ascii="Arial" w:hAnsi="Arial"/>
-                <w:bCs/>
-                <w:noProof/>
                 <w:color w:val="000000" w:themeColor="text1"/>
                 <w:sz w:val="16"/>
                 <w:szCs w:val="16"/>
@@ -3968,7 +4222,6 @@
             <w:r>
               <w:rPr>
                 <w:rFonts w:ascii="Arial" w:hAnsi="Arial"/>
-                <w:bCs/>
                 <w:color w:val="000000" w:themeColor="text1"/>
                 <w:sz w:val="16"/>
                 <w:szCs w:val="16"/>

</xml_diff>